<commit_message>
feat(submission): RMK Pert. 6 enhanced — TPGS Ch.6 full audit + 4 embedded figures
- Add generate_rmk6_enhanced.py: PyMuPDF figure extraction (Figure 6.1,
  C&C 6.1 Etsy, C&C 6.2 Walmart, C&C 6.3 Tesla) at 2x resolution
- Expand RMK with 12 missing TPGS Ch.6 sections: 6 attack bases, rival
  targeting, blocking/signaling tactics, early/late mover framework,
  M&A failure causes (synergy overestimation as most common), 4 VI
  advantages, 3 VI disadvantages, alliance failure modes, hollowing-out risk
- Add §10 Poin-Poin Kunci with LO6-1 through LO6-5
- Output: 1.6 MB DOCX (up from 37 KB) with 4 textbook figures embedded

Co-Authored-By: Claude Sonnet 4.6 <noreply@anthropic.com>
</commit_message>
<xml_diff>
--- a/RMK/01079_Dzaki Muhammad Yusfian_RMK Pert. 6.docx
+++ b/RMK/01079_Dzaki Muhammad Yusfian_RMK Pert. 6.docx
@@ -2,7 +2,7 @@
 <file path=word/document.xml><?xml version="1.0" encoding="utf-8"?>
 <w:document xmlns:w="http://schemas.openxmlformats.org/wordprocessingml/2006/main" xmlns:m="http://schemas.openxmlformats.org/officeDocument/2006/math" xmlns:r="http://schemas.openxmlformats.org/officeDocument/2006/relationships" xmlns:o="urn:schemas-microsoft-com:office:office" xmlns:v="urn:schemas-microsoft-com:vml" xmlns:w10="urn:schemas-microsoft-com:office:word" xmlns:a="http://schemas.openxmlformats.org/drawingml/2006/main" xmlns:pic="http://schemas.openxmlformats.org/drawingml/2006/picture" xmlns:wp="http://schemas.openxmlformats.org/drawingml/2006/wordprocessingDrawing">
   <w:body>
-    <w:bookmarkStart w:id="55" w:name="ringkasan-materi-kuliah-pertemuan-6"/>
+    <w:bookmarkStart w:id="83" w:name="ringkasan-materi-kuliah-pertemuan-6"/>
     <w:p>
       <w:pPr>
         <w:pStyle w:val="Heading1"/>
@@ -100,7 +100,7 @@
         </w:pict>
       </w:r>
     </w:p>
-    <w:bookmarkStart w:id="12" w:name="pendahuluan"/>
+    <w:bookmarkStart w:id="15" w:name="pendahuluan"/>
     <w:p>
       <w:pPr>
         <w:pStyle w:val="Heading2"/>
@@ -109,7 +109,7 @@
         <w:t xml:space="preserve">1. Pendahuluan</w:t>
       </w:r>
     </w:p>
-    <w:bookmarkStart w:id="9" w:name="X3b1bbdf67831180f4a9735e5f21ef17c536d6da"/>
+    <w:bookmarkStart w:id="12" w:name="X3b1bbdf67831180f4a9735e5f21ef17c536d6da"/>
     <w:p>
       <w:pPr>
         <w:pStyle w:val="Heading3"/>
@@ -280,8 +280,79 @@
         <w:t xml:space="preserve">dalam konteks lima kekuatan industri yang sudah dikenal mahasiswa, sementara TPGS Ch.6 (Gamble, Peteraf &amp; Thompson 2021) menyediakan taksonomi taktis yang lebih kaya tentang kapan dan bagaimana setiap gerakan dipilih.</w:t>
       </w:r>
     </w:p>
-    <w:bookmarkEnd w:id="9"/>
-    <w:bookmarkStart w:id="10" w:name="pertanyaan-inti-yang-akan-dijawab"/>
+    <w:p>
+      <w:pPr>
+        <w:pStyle w:val="CaptionedFigure"/>
+      </w:pPr>
+      <w:r>
+        <w:drawing>
+          <wp:inline>
+            <wp:extent cx="5791200" cy="6764891"/>
+            <wp:effectExtent b="0" l="0" r="0" t="0"/>
+            <wp:docPr descr="Gambar 6.1 — Strategi untuk Memperkuat Posisi Kompetitif Perusahaan" title="" id="10" name="Picture"/>
+            <a:graphic>
+              <a:graphicData uri="http://schemas.openxmlformats.org/drawingml/2006/picture">
+                <pic:pic>
+                  <pic:nvPicPr>
+                    <pic:cNvPr descr="D:/DZAKI/S2/Sem.%201/Manajemen%20Strategik/Dev%20Assistant/temp/ch6_figures/figure_6_1.png" id="11" name="Picture"/>
+                    <pic:cNvPicPr>
+                      <a:picLocks noChangeArrowheads="1" noChangeAspect="1"/>
+                    </pic:cNvPicPr>
+                  </pic:nvPicPr>
+                  <pic:blipFill>
+                    <a:blip r:embed="rId9"/>
+                    <a:stretch>
+                      <a:fillRect/>
+                    </a:stretch>
+                  </pic:blipFill>
+                  <pic:spPr bwMode="auto">
+                    <a:xfrm>
+                      <a:off x="0" y="0"/>
+                      <a:ext cx="5791200" cy="6764891"/>
+                    </a:xfrm>
+                    <a:prstGeom prst="rect">
+                      <a:avLst/>
+                    </a:prstGeom>
+                    <a:noFill/>
+                    <a:ln w="9525">
+                      <a:noFill/>
+                      <a:headEnd/>
+                      <a:tailEnd/>
+                    </a:ln>
+                  </pic:spPr>
+                </pic:pic>
+              </a:graphicData>
+            </a:graphic>
+          </wp:inline>
+        </w:drawing>
+      </w:r>
+    </w:p>
+    <w:p>
+      <w:pPr>
+        <w:pStyle w:val="ImageCaption"/>
+      </w:pPr>
+      <w:r>
+        <w:rPr>
+          <w:i/>
+          <w:iCs/>
+        </w:rPr>
+        <w:t xml:space="preserve">Gambar 6.1 — Strategi untuk Memperkuat Posisi Kompetitif Perusahaan</w:t>
+      </w:r>
+    </w:p>
+    <w:p>
+      <w:pPr>
+        <w:pStyle w:val="BodyText"/>
+      </w:pPr>
+      <w:r>
+        <w:rPr>
+          <w:i/>
+          <w:iCs/>
+        </w:rPr>
+        <w:t xml:space="preserve">Sumber: Gamble, Thompson &amp; Peteraf (2021), Essentials of Strategic Management, Ch.6, p.111</w:t>
+      </w:r>
+    </w:p>
+    <w:bookmarkEnd w:id="12"/>
+    <w:bookmarkStart w:id="13" w:name="pertanyaan-inti-yang-akan-dijawab"/>
     <w:p>
       <w:pPr>
         <w:pStyle w:val="Heading3"/>
@@ -337,8 +408,8 @@
         <w:t xml:space="preserve">. Ketiga pertanyaan ini bukan pilihan independen; jawaban atas satu pertanyaan akan membatasi pilihan yang masuk akal untuk dua pertanyaan lainnya. Sebuah serangan ofensif terhadap pemimpin pasar, misalnya, hanya kredibel bila perusahaan memiliki lingkup sumber daya internal yang memadai dan memilih waktu serangan yang tepat dengan kondisi makro industri.</w:t>
       </w:r>
     </w:p>
-    <w:bookmarkEnd w:id="10"/>
-    <w:bookmarkStart w:id="11" w:name="Xd4a2e6ddeabd569fa5dd3655c6e7e3277a45420"/>
+    <w:bookmarkEnd w:id="13"/>
+    <w:bookmarkStart w:id="14" w:name="Xd4a2e6ddeabd569fa5dd3655c6e7e3277a45420"/>
     <w:p>
       <w:pPr>
         <w:pStyle w:val="Heading3"/>
@@ -423,9 +494,9 @@
         </w:pict>
       </w:r>
     </w:p>
-    <w:bookmarkEnd w:id="11"/>
-    <w:bookmarkEnd w:id="12"/>
-    <w:bookmarkStart w:id="18" w:name="offensive-strategies"/>
+    <w:bookmarkEnd w:id="14"/>
+    <w:bookmarkEnd w:id="15"/>
+    <w:bookmarkStart w:id="23" w:name="offensive-strategies"/>
     <w:p>
       <w:pPr>
         <w:pStyle w:val="Heading2"/>
@@ -444,7 +515,7 @@
         <w:t xml:space="preserve">Offensive Strategies</w:t>
       </w:r>
     </w:p>
-    <w:bookmarkStart w:id="13" w:name="frontal-attack"/>
+    <w:bookmarkStart w:id="16" w:name="frontal-attack"/>
     <w:p>
       <w:pPr>
         <w:pStyle w:val="Heading3"/>
@@ -566,8 +637,8 @@
         <w:t xml:space="preserve">yang berhasil dalam sejarah korporat sering dilakukan oleh perusahaan dengan akses modal yang substansial dan komitmen jangka panjang terhadap pasar yang diserang.</w:t>
       </w:r>
     </w:p>
-    <w:bookmarkEnd w:id="13"/>
-    <w:bookmarkStart w:id="14" w:name="flanking-attack"/>
+    <w:bookmarkEnd w:id="16"/>
+    <w:bookmarkStart w:id="17" w:name="flanking-attack"/>
     <w:p>
       <w:pPr>
         <w:pStyle w:val="Heading3"/>
@@ -715,8 +786,8 @@
         <w:t xml:space="preserve">sendiri menjadi lebih sulit ditandingi karena pelanggan sudah terikat pada GoPay dan jaringan merchant.</w:t>
       </w:r>
     </w:p>
-    <w:bookmarkEnd w:id="14"/>
-    <w:bookmarkStart w:id="15" w:name="guerrilla-warfare"/>
+    <w:bookmarkEnd w:id="17"/>
+    <w:bookmarkStart w:id="18" w:name="guerrilla-warfare"/>
     <w:p>
       <w:pPr>
         <w:pStyle w:val="Heading3"/>
@@ -763,8 +834,8 @@
         <w:t xml:space="preserve">tidak memenangkan posisi pasar yang berkelanjutan, hanya memperlambat ekspansi pesaing.</w:t>
       </w:r>
     </w:p>
-    <w:bookmarkEnd w:id="15"/>
-    <w:bookmarkStart w:id="16" w:name="preemptive-strike"/>
+    <w:bookmarkEnd w:id="18"/>
+    <w:bookmarkStart w:id="19" w:name="preemptive-strike"/>
     <w:p>
       <w:pPr>
         <w:pStyle w:val="Heading3"/>
@@ -902,8 +973,394 @@
         <w:t xml:space="preserve">terhadap Shopee melalui program edukasi penjual yang membentuk loyalitas penjual menengah dan kecil sebelum Shopee memprioritaskan segmen tersebut.</w:t>
       </w:r>
     </w:p>
-    <w:bookmarkEnd w:id="16"/>
-    <w:bookmarkStart w:id="17" w:name="kapan-menyerang-vs.-kapan-mengisi-celah"/>
+    <w:bookmarkEnd w:id="19"/>
+    <w:bookmarkStart w:id="20" w:name="X15378114a05d9badd3ee87ae4fbd1dbd9686f77"/>
+    <w:p>
+      <w:pPr>
+        <w:pStyle w:val="Heading3"/>
+      </w:pPr>
+      <w:r>
+        <w:t xml:space="preserve">Memilih Basis Serangan Kompetitif (TPGS Ch.6, p.151)</w:t>
+      </w:r>
+    </w:p>
+    <w:p>
+      <w:pPr>
+        <w:pStyle w:val="FirstParagraph"/>
+      </w:pPr>
+      <w:r>
+        <w:t xml:space="preserve">TPGS mengidentifikasi enam basis yang dapat dipilih sebuah perusahaan ketika memutuskan menyerang pesaing:</w:t>
+      </w:r>
+    </w:p>
+    <w:p>
+      <w:pPr>
+        <w:pStyle w:val="Compact"/>
+        <w:numPr>
+          <w:ilvl w:val="0"/>
+          <w:numId w:val="1001"/>
+        </w:numPr>
+      </w:pPr>
+      <w:r>
+        <w:rPr>
+          <w:b/>
+          <w:bCs/>
+        </w:rPr>
+        <w:t xml:space="preserve">Keunggulan biaya</w:t>
+      </w:r>
+      <w:r>
+        <w:t xml:space="preserve"> </w:t>
+      </w:r>
+      <w:r>
+        <w:t xml:space="preserve">— menyerang dengan harga lebih rendah ketika pesaing tidak dapat menandingi struktur biaya</w:t>
+      </w:r>
+    </w:p>
+    <w:p>
+      <w:pPr>
+        <w:pStyle w:val="Compact"/>
+        <w:numPr>
+          <w:ilvl w:val="0"/>
+          <w:numId w:val="1001"/>
+        </w:numPr>
+      </w:pPr>
+      <w:r>
+        <w:rPr>
+          <w:b/>
+          <w:bCs/>
+        </w:rPr>
+        <w:t xml:space="preserve">Segmen pembeli yang kurang terlayani</w:t>
+      </w:r>
+      <w:r>
+        <w:t xml:space="preserve"> </w:t>
+      </w:r>
+      <w:r>
+        <w:t xml:space="preserve">(</w:t>
+      </w:r>
+      <w:r>
+        <w:rPr>
+          <w:i/>
+          <w:iCs/>
+        </w:rPr>
+        <w:t xml:space="preserve">underserved buyer segments</w:t>
+      </w:r>
+      <w:r>
+        <w:t xml:space="preserve">) — mengisi kebutuhan yang diabaikan pemain dominan</w:t>
+      </w:r>
+    </w:p>
+    <w:p>
+      <w:pPr>
+        <w:pStyle w:val="Compact"/>
+        <w:numPr>
+          <w:ilvl w:val="0"/>
+          <w:numId w:val="1001"/>
+        </w:numPr>
+      </w:pPr>
+      <w:r>
+        <w:rPr>
+          <w:b/>
+          <w:bCs/>
+        </w:rPr>
+        <w:t xml:space="preserve">Celah kualitas, layanan, atau fitur</w:t>
+      </w:r>
+      <w:r>
+        <w:t xml:space="preserve"> </w:t>
+      </w:r>
+      <w:r>
+        <w:t xml:space="preserve">— menawarkan produk yang lebih baik di dimensi yang diabaikan pesaing</w:t>
+      </w:r>
+    </w:p>
+    <w:p>
+      <w:pPr>
+        <w:pStyle w:val="Compact"/>
+        <w:numPr>
+          <w:ilvl w:val="0"/>
+          <w:numId w:val="1001"/>
+        </w:numPr>
+      </w:pPr>
+      <w:r>
+        <w:rPr>
+          <w:b/>
+          <w:bCs/>
+        </w:rPr>
+        <w:t xml:space="preserve">Inovasi produk atau proses</w:t>
+      </w:r>
+      <w:r>
+        <w:t xml:space="preserve"> </w:t>
+      </w:r>
+      <w:r>
+        <w:t xml:space="preserve">— melompati generasi teknologi pesaing dengan</w:t>
+      </w:r>
+      <w:r>
+        <w:t xml:space="preserve"> </w:t>
+      </w:r>
+      <w:r>
+        <w:rPr>
+          <w:i/>
+          <w:iCs/>
+        </w:rPr>
+        <w:t xml:space="preserve">leapfrog innovation</w:t>
+      </w:r>
+    </w:p>
+    <w:p>
+      <w:pPr>
+        <w:pStyle w:val="Compact"/>
+        <w:numPr>
+          <w:ilvl w:val="0"/>
+          <w:numId w:val="1001"/>
+        </w:numPr>
+      </w:pPr>
+      <w:r>
+        <w:rPr>
+          <w:b/>
+          <w:bCs/>
+        </w:rPr>
+        <w:t xml:space="preserve">Kesenjangan kesadaran merek</w:t>
+      </w:r>
+      <w:r>
+        <w:t xml:space="preserve"> </w:t>
+      </w:r>
+      <w:r>
+        <w:t xml:space="preserve">— membangun</w:t>
+      </w:r>
+      <w:r>
+        <w:t xml:space="preserve"> </w:t>
+      </w:r>
+      <w:r>
+        <w:rPr>
+          <w:i/>
+          <w:iCs/>
+        </w:rPr>
+        <w:t xml:space="preserve">brand</w:t>
+      </w:r>
+      <w:r>
+        <w:t xml:space="preserve"> </w:t>
+      </w:r>
+      <w:r>
+        <w:t xml:space="preserve">di pasar di mana pemimpin memiliki kelemahan reputasi</w:t>
+      </w:r>
+    </w:p>
+    <w:p>
+      <w:pPr>
+        <w:pStyle w:val="Compact"/>
+        <w:numPr>
+          <w:ilvl w:val="0"/>
+          <w:numId w:val="1001"/>
+        </w:numPr>
+      </w:pPr>
+      <w:r>
+        <w:rPr>
+          <w:b/>
+          <w:bCs/>
+        </w:rPr>
+        <w:t xml:space="preserve">Celah distribusi</w:t>
+      </w:r>
+      <w:r>
+        <w:t xml:space="preserve"> </w:t>
+      </w:r>
+      <w:r>
+        <w:t xml:space="preserve">— memasuki saluran distribusi yang belum dimanfaatkan pesaing utama</w:t>
+      </w:r>
+    </w:p>
+    <w:p>
+      <w:pPr>
+        <w:pStyle w:val="FirstParagraph"/>
+      </w:pPr>
+      <w:r>
+        <w:rPr>
+          <w:b/>
+          <w:bCs/>
+        </w:rPr>
+        <w:t xml:space="preserve">Kelima basis ini bukan pilihan eksklusif</w:t>
+      </w:r>
+      <w:r>
+        <w:t xml:space="preserve"> </w:t>
+      </w:r>
+      <w:r>
+        <w:t xml:space="preserve">— perusahaan yang sukses sering menggabungkan dua atau tiga basis sekaligus, misalnya menyerang dengan keunggulan biaya pada segmen yang kurang terlayani melalui saluran distribusi yang belum dimanfaatkan pesaing.</w:t>
+      </w:r>
+    </w:p>
+    <w:bookmarkEnd w:id="20"/>
+    <w:bookmarkStart w:id="21" w:name="X962bd48a14795da9505b5e3446a14552bbac716"/>
+    <w:p>
+      <w:pPr>
+        <w:pStyle w:val="Heading3"/>
+      </w:pPr>
+      <w:r>
+        <w:t xml:space="preserve">Memilih Pesaing yang Akan Diserang (TPGS Ch.6, p.152)</w:t>
+      </w:r>
+    </w:p>
+    <w:p>
+      <w:pPr>
+        <w:pStyle w:val="FirstParagraph"/>
+      </w:pPr>
+      <w:r>
+        <w:t xml:space="preserve">Setelah basis serangan dipilih, pertanyaan berikutnya adalah pesaing mana yang menjadi target. TPGS membedakan tiga kategori target:</w:t>
+      </w:r>
+    </w:p>
+    <w:p>
+      <w:pPr>
+        <w:pStyle w:val="Compact"/>
+        <w:numPr>
+          <w:ilvl w:val="0"/>
+          <w:numId w:val="1002"/>
+        </w:numPr>
+      </w:pPr>
+      <w:r>
+        <w:rPr>
+          <w:b/>
+          <w:bCs/>
+        </w:rPr>
+        <w:t xml:space="preserve">Pemimpin pasar yang rentan</w:t>
+      </w:r>
+      <w:r>
+        <w:t xml:space="preserve">: efektif ketika pemimpin lalai, memiliki kelemahan produk/layanan, atau tidak merespons perubahan pasar. Tanda-tanda kerentanan termasuk profitabilitas yang menurun, pelanggan yang tidak puas, dan investasi</w:t>
+      </w:r>
+      <w:r>
+        <w:t xml:space="preserve"> </w:t>
+      </w:r>
+      <w:r>
+        <w:rPr>
+          <w:i/>
+          <w:iCs/>
+        </w:rPr>
+        <w:t xml:space="preserve">brand</w:t>
+      </w:r>
+      <w:r>
+        <w:t xml:space="preserve"> </w:t>
+      </w:r>
+      <w:r>
+        <w:t xml:space="preserve">yang mulai meredup.</w:t>
+      </w:r>
+    </w:p>
+    <w:p>
+      <w:pPr>
+        <w:pStyle w:val="Compact"/>
+        <w:numPr>
+          <w:ilvl w:val="0"/>
+          <w:numId w:val="1002"/>
+        </w:numPr>
+      </w:pPr>
+      <w:r>
+        <w:rPr>
+          <w:b/>
+          <w:bCs/>
+        </w:rPr>
+        <w:t xml:space="preserve">Perusahaan</w:t>
+      </w:r>
+      <w:r>
+        <w:rPr>
+          <w:b/>
+          <w:bCs/>
+        </w:rPr>
+        <w:t xml:space="preserve"> </w:t>
+      </w:r>
+      <w:r>
+        <w:rPr>
+          <w:b/>
+          <w:bCs/>
+          <w:i/>
+          <w:iCs/>
+        </w:rPr>
+        <w:t xml:space="preserve">runner-up</w:t>
+      </w:r>
+      <w:r>
+        <w:t xml:space="preserve">: target yang lebih mudah karena sumber daya lebih terbatas dan posisi lebih lemah. Menyerang</w:t>
+      </w:r>
+      <w:r>
+        <w:t xml:space="preserve"> </w:t>
+      </w:r>
+      <w:r>
+        <w:rPr>
+          <w:i/>
+          <w:iCs/>
+        </w:rPr>
+        <w:t xml:space="preserve">runner-up</w:t>
+      </w:r>
+      <w:r>
+        <w:t xml:space="preserve"> </w:t>
+      </w:r>
+      <w:r>
+        <w:t xml:space="preserve">sering memberikan kemenangan yang lebih cepat dan memperkuat posisi penyerang sebelum berhadapan dengan pemimpin.</w:t>
+      </w:r>
+    </w:p>
+    <w:p>
+      <w:pPr>
+        <w:pStyle w:val="Compact"/>
+        <w:numPr>
+          <w:ilvl w:val="0"/>
+          <w:numId w:val="1002"/>
+        </w:numPr>
+      </w:pPr>
+      <w:r>
+        <w:rPr>
+          <w:b/>
+          <w:bCs/>
+        </w:rPr>
+        <w:t xml:space="preserve">Menghindari</w:t>
+      </w:r>
+      <w:r>
+        <w:rPr>
+          <w:b/>
+          <w:bCs/>
+        </w:rPr>
+        <w:t xml:space="preserve"> </w:t>
+      </w:r>
+      <w:r>
+        <w:rPr>
+          <w:b/>
+          <w:bCs/>
+          <w:i/>
+          <w:iCs/>
+        </w:rPr>
+        <w:t xml:space="preserve">strong fighters</w:t>
+      </w:r>
+      <w:r>
+        <w:t xml:space="preserve">: perusahaan dengan kas dalam, kapasitas produksi cadangan, dan kemauan membalas.</w:t>
+      </w:r>
+      <w:r>
+        <w:t xml:space="preserve"> </w:t>
+      </w:r>
+      <w:r>
+        <w:rPr>
+          <w:b/>
+          <w:bCs/>
+        </w:rPr>
+        <w:t xml:space="preserve">Menyerang</w:t>
+      </w:r>
+      <w:r>
+        <w:rPr>
+          <w:b/>
+          <w:bCs/>
+        </w:rPr>
+        <w:t xml:space="preserve"> </w:t>
+      </w:r>
+      <w:r>
+        <w:rPr>
+          <w:b/>
+          <w:bCs/>
+          <w:i/>
+          <w:iCs/>
+        </w:rPr>
+        <w:t xml:space="preserve">strong fighter</w:t>
+      </w:r>
+      <w:r>
+        <w:rPr>
+          <w:b/>
+          <w:bCs/>
+        </w:rPr>
+        <w:t xml:space="preserve"> </w:t>
+      </w:r>
+      <w:r>
+        <w:rPr>
+          <w:b/>
+          <w:bCs/>
+        </w:rPr>
+        <w:t xml:space="preserve">hampir selalu berakhir mahal tanpa hasil</w:t>
+      </w:r>
+      <w:r>
+        <w:t xml:space="preserve">, karena pesaing tipe ini memiliki kemauan dan kemampuan untuk merespons dengan kerusakan resiprokal yang substansial.</w:t>
+      </w:r>
+    </w:p>
+    <w:bookmarkEnd w:id="21"/>
+    <w:bookmarkStart w:id="22" w:name="kapan-menyerang-vs.-kapan-mengisi-celah"/>
     <w:p>
       <w:pPr>
         <w:pStyle w:val="Heading3"/>
@@ -998,9 +1455,9 @@
         </w:pict>
       </w:r>
     </w:p>
-    <w:bookmarkEnd w:id="17"/>
-    <w:bookmarkEnd w:id="18"/>
-    <w:bookmarkStart w:id="23" w:name="defensive-strategies"/>
+    <w:bookmarkEnd w:id="22"/>
+    <w:bookmarkEnd w:id="23"/>
+    <w:bookmarkStart w:id="30" w:name="defensive-strategies"/>
     <w:p>
       <w:pPr>
         <w:pStyle w:val="Heading2"/>
@@ -1019,7 +1476,7 @@
         <w:t xml:space="preserve">Defensive Strategies</w:t>
       </w:r>
     </w:p>
-    <w:bookmarkStart w:id="19" w:name="fortify-and-defend"/>
+    <w:bookmarkStart w:id="24" w:name="fortify-and-defend"/>
     <w:p>
       <w:pPr>
         <w:pStyle w:val="Heading3"/>
@@ -1108,13 +1565,185 @@
         <w:t xml:space="preserve">.</w:t>
       </w:r>
     </w:p>
-    <w:bookmarkEnd w:id="19"/>
-    <w:bookmarkStart w:id="20" w:name="signaling-teori-kredibilitas"/>
+    <w:bookmarkEnd w:id="24"/>
+    <w:bookmarkStart w:id="25" w:name="Xd4dd496fbb4ed472921786e84d3ff3b8fba0c38"/>
     <w:p>
       <w:pPr>
         <w:pStyle w:val="Heading3"/>
       </w:pPr>
       <w:r>
+        <w:t xml:space="preserve">Memblokir Jalur yang Terbuka bagi Penantang (TPGS Ch.6, p.154)</w:t>
+      </w:r>
+    </w:p>
+    <w:p>
+      <w:pPr>
+        <w:pStyle w:val="FirstParagraph"/>
+      </w:pPr>
+      <w:r>
+        <w:t xml:space="preserve">TPGS memberi taksonomi konkret tentang bagaimana operasionalisasi</w:t>
+      </w:r>
+      <w:r>
+        <w:t xml:space="preserve"> </w:t>
+      </w:r>
+      <w:r>
+        <w:rPr>
+          <w:i/>
+          <w:iCs/>
+        </w:rPr>
+        <w:t xml:space="preserve">fortify-and-defend</w:t>
+      </w:r>
+      <w:r>
+        <w:t xml:space="preserve">, yaitu dengan secara aktif menutup jalur yang terbuka bagi penantang potensial:</w:t>
+      </w:r>
+    </w:p>
+    <w:p>
+      <w:pPr>
+        <w:pStyle w:val="Compact"/>
+        <w:numPr>
+          <w:ilvl w:val="0"/>
+          <w:numId w:val="1003"/>
+        </w:numPr>
+      </w:pPr>
+      <w:r>
+        <w:rPr>
+          <w:b/>
+          <w:bCs/>
+        </w:rPr>
+        <w:t xml:space="preserve">Memperluas lini produk</w:t>
+      </w:r>
+      <w:r>
+        <w:t xml:space="preserve"> </w:t>
+      </w:r>
+      <w:r>
+        <w:t xml:space="preserve">untuk menutup celah yang dapat dieksploitasi penantang</w:t>
+      </w:r>
+    </w:p>
+    <w:p>
+      <w:pPr>
+        <w:pStyle w:val="Compact"/>
+        <w:numPr>
+          <w:ilvl w:val="0"/>
+          <w:numId w:val="1003"/>
+        </w:numPr>
+      </w:pPr>
+      <w:r>
+        <w:rPr>
+          <w:b/>
+          <w:bCs/>
+        </w:rPr>
+        <w:t xml:space="preserve">Memperkenalkan model ekonomi dan premium</w:t>
+      </w:r>
+      <w:r>
+        <w:t xml:space="preserve"> </w:t>
+      </w:r>
+      <w:r>
+        <w:t xml:space="preserve">untuk menutup rentang harga yang kosong</w:t>
+      </w:r>
+    </w:p>
+    <w:p>
+      <w:pPr>
+        <w:pStyle w:val="Compact"/>
+        <w:numPr>
+          <w:ilvl w:val="0"/>
+          <w:numId w:val="1003"/>
+        </w:numPr>
+      </w:pPr>
+      <w:r>
+        <w:rPr>
+          <w:b/>
+          <w:bCs/>
+        </w:rPr>
+        <w:t xml:space="preserve">Mempertahankan hubungan kuat dengan dealer dan distributor</w:t>
+      </w:r>
+      <w:r>
+        <w:t xml:space="preserve"> </w:t>
+      </w:r>
+      <w:r>
+        <w:t xml:space="preserve">melalui insentif eksklusif jangka panjang</w:t>
+      </w:r>
+    </w:p>
+    <w:p>
+      <w:pPr>
+        <w:pStyle w:val="Compact"/>
+        <w:numPr>
+          <w:ilvl w:val="0"/>
+          <w:numId w:val="1003"/>
+        </w:numPr>
+      </w:pPr>
+      <w:r>
+        <w:rPr>
+          <w:b/>
+          <w:bCs/>
+        </w:rPr>
+        <w:t xml:space="preserve">Menawarkan program loyalitas pembeli</w:t>
+      </w:r>
+      <w:r>
+        <w:t xml:space="preserve"> </w:t>
+      </w:r>
+      <w:r>
+        <w:t xml:space="preserve">yang meningkatkan</w:t>
+      </w:r>
+      <w:r>
+        <w:t xml:space="preserve"> </w:t>
+      </w:r>
+      <w:r>
+        <w:rPr>
+          <w:i/>
+          <w:iCs/>
+        </w:rPr>
+        <w:t xml:space="preserve">switching costs</w:t>
+      </w:r>
+    </w:p>
+    <w:p>
+      <w:pPr>
+        <w:pStyle w:val="Compact"/>
+        <w:numPr>
+          <w:ilvl w:val="0"/>
+          <w:numId w:val="1003"/>
+        </w:numPr>
+      </w:pPr>
+      <w:r>
+        <w:rPr>
+          <w:b/>
+          <w:bCs/>
+        </w:rPr>
+        <w:t xml:space="preserve">Membangun kapasitas cadangan</w:t>
+      </w:r>
+      <w:r>
+        <w:t xml:space="preserve"> </w:t>
+      </w:r>
+      <w:r>
+        <w:t xml:space="preserve">untuk dapat merespons serangan dengan cepat dan agresif</w:t>
+      </w:r>
+    </w:p>
+    <w:p>
+      <w:pPr>
+        <w:pStyle w:val="FirstParagraph"/>
+      </w:pPr>
+      <w:r>
+        <w:t xml:space="preserve">Logika di balik kelima taktik ini sama:</w:t>
+      </w:r>
+      <w:r>
+        <w:t xml:space="preserve"> </w:t>
+      </w:r>
+      <w:r>
+        <w:rPr>
+          <w:b/>
+          <w:bCs/>
+        </w:rPr>
+        <w:t xml:space="preserve">mengurangi jumlah celah yang dapat dimanfaatkan pesaing</w:t>
+      </w:r>
+      <w:r>
+        <w:t xml:space="preserve">, sehingga setiap calon penantang harus menanggung biaya masuk yang substansial sebelum bahkan dapat memulai serangan.</w:t>
+      </w:r>
+    </w:p>
+    <w:bookmarkEnd w:id="25"/>
+    <w:bookmarkStart w:id="26" w:name="signaling-teori-kredibilitas"/>
+    <w:p>
+      <w:pPr>
+        <w:pStyle w:val="Heading3"/>
+      </w:pPr>
+      <w:r>
         <w:rPr>
           <w:i/>
           <w:iCs/>
@@ -1220,13 +1849,212 @@
         <w:t xml:space="preserve">berlapis — A Mild, Sampoerna Hijau, Dji Sam Soe — sebagai sinyal kepada Gudang Garam dan Bentoel bahwa perusahaan tidak akan menyerahkan satu pun segmen tanpa pertahanan ekonomis yang substansial.</w:t>
       </w:r>
     </w:p>
-    <w:bookmarkEnd w:id="20"/>
-    <w:bookmarkStart w:id="21" w:name="mobile-defense-dan-counteroffensive"/>
+    <w:bookmarkEnd w:id="26"/>
+    <w:bookmarkStart w:id="27" w:name="X60e2170cbac3612d2b8fd3174985affb950056f"/>
     <w:p>
       <w:pPr>
         <w:pStyle w:val="Heading3"/>
       </w:pPr>
       <w:r>
+        <w:t xml:space="preserve">Memberi Sinyal Bahwa Pembalasan Sangat Mungkin (TPGS Ch.6, p.154)</w:t>
+      </w:r>
+    </w:p>
+    <w:p>
+      <w:pPr>
+        <w:pStyle w:val="FirstParagraph"/>
+      </w:pPr>
+      <w:r>
+        <w:t xml:space="preserve">Per</w:t>
+      </w:r>
+      <w:r>
+        <w:t xml:space="preserve"> </w:t>
+      </w:r>
+      <w:r>
+        <w:rPr>
+          <w:i/>
+          <w:iCs/>
+        </w:rPr>
+        <w:t xml:space="preserve">credibility theory</w:t>
+      </w:r>
+      <w:r>
+        <w:t xml:space="preserve"> </w:t>
+      </w:r>
+      <w:r>
+        <w:t xml:space="preserve">(Schelling 1960): ancaman pembalasan hanya efektif jika</w:t>
+      </w:r>
+      <w:r>
+        <w:t xml:space="preserve"> </w:t>
+      </w:r>
+      <w:r>
+        <w:rPr>
+          <w:b/>
+          <w:bCs/>
+        </w:rPr>
+        <w:t xml:space="preserve">kredibel</w:t>
+      </w:r>
+      <w:r>
+        <w:t xml:space="preserve"> </w:t>
+      </w:r>
+      <w:r>
+        <w:t xml:space="preserve">— artinya, biaya</w:t>
+      </w:r>
+      <w:r>
+        <w:t xml:space="preserve"> </w:t>
+      </w:r>
+      <w:r>
+        <w:rPr>
+          <w:i/>
+          <w:iCs/>
+        </w:rPr>
+        <w:t xml:space="preserve">tidak</w:t>
+      </w:r>
+      <w:r>
+        <w:t xml:space="preserve"> </w:t>
+      </w:r>
+      <w:r>
+        <w:t xml:space="preserve">membalas harus lebih tinggi dari biaya membalas. TPGS mengidentifikasi empat sinyal yang efektif dalam praktik:</w:t>
+      </w:r>
+    </w:p>
+    <w:p>
+      <w:pPr>
+        <w:pStyle w:val="Compact"/>
+        <w:numPr>
+          <w:ilvl w:val="0"/>
+          <w:numId w:val="1004"/>
+        </w:numPr>
+      </w:pPr>
+      <w:r>
+        <w:rPr>
+          <w:b/>
+          <w:bCs/>
+        </w:rPr>
+        <w:t xml:space="preserve">Pengumuman publik</w:t>
+      </w:r>
+      <w:r>
+        <w:t xml:space="preserve"> </w:t>
+      </w:r>
+      <w:r>
+        <w:t xml:space="preserve">tentang niat mempertahankan posisi dengan tegas, sehingga setiap kemunduran akan menjadi kerugian reputasi yang nyata</w:t>
+      </w:r>
+    </w:p>
+    <w:p>
+      <w:pPr>
+        <w:pStyle w:val="Compact"/>
+        <w:numPr>
+          <w:ilvl w:val="0"/>
+          <w:numId w:val="1004"/>
+        </w:numPr>
+      </w:pPr>
+      <w:r>
+        <w:rPr>
+          <w:b/>
+          <w:bCs/>
+        </w:rPr>
+        <w:t xml:space="preserve">Segera menyamakan atau melampaui pemotongan harga pesaing</w:t>
+      </w:r>
+      <w:r>
+        <w:t xml:space="preserve">, sehingga penantang tidak dapat mengakumulasi pangsa dari taktik harga jangka pendek</w:t>
+      </w:r>
+    </w:p>
+    <w:p>
+      <w:pPr>
+        <w:pStyle w:val="Compact"/>
+        <w:numPr>
+          <w:ilvl w:val="0"/>
+          <w:numId w:val="1004"/>
+        </w:numPr>
+      </w:pPr>
+      <w:r>
+        <w:rPr>
+          <w:b/>
+          <w:bCs/>
+        </w:rPr>
+        <w:t xml:space="preserve">Membangun</w:t>
+      </w:r>
+      <w:r>
+        <w:rPr>
+          <w:b/>
+          <w:bCs/>
+        </w:rPr>
+        <w:t xml:space="preserve"> </w:t>
+      </w:r>
+      <w:r>
+        <w:rPr>
+          <w:b/>
+          <w:bCs/>
+          <w:i/>
+          <w:iCs/>
+        </w:rPr>
+        <w:t xml:space="preserve">war chest</w:t>
+      </w:r>
+      <w:r>
+        <w:rPr>
+          <w:b/>
+          <w:bCs/>
+        </w:rPr>
+        <w:t xml:space="preserve"> </w:t>
+      </w:r>
+      <w:r>
+        <w:rPr>
+          <w:b/>
+          <w:bCs/>
+        </w:rPr>
+        <w:t xml:space="preserve">kas dan surat berharga yang tampak dari luar</w:t>
+      </w:r>
+      <w:r>
+        <w:t xml:space="preserve"> </w:t>
+      </w:r>
+      <w:r>
+        <w:t xml:space="preserve">— sinyal bahwa perusahaan siap secara finansial untuk</w:t>
+      </w:r>
+      <w:r>
+        <w:t xml:space="preserve"> </w:t>
+      </w:r>
+      <w:r>
+        <w:rPr>
+          <w:i/>
+          <w:iCs/>
+        </w:rPr>
+        <w:t xml:space="preserve">price war</w:t>
+      </w:r>
+      <w:r>
+        <w:t xml:space="preserve"> </w:t>
+      </w:r>
+      <w:r>
+        <w:t xml:space="preserve">berkepanjangan</w:t>
+      </w:r>
+    </w:p>
+    <w:p>
+      <w:pPr>
+        <w:pStyle w:val="Compact"/>
+        <w:numPr>
+          <w:ilvl w:val="0"/>
+          <w:numId w:val="1004"/>
+        </w:numPr>
+      </w:pPr>
+      <w:r>
+        <w:rPr>
+          <w:b/>
+          <w:bCs/>
+          <w:i/>
+          <w:iCs/>
+        </w:rPr>
+        <w:t xml:space="preserve">Cross-parry</w:t>
+      </w:r>
+      <w:r>
+        <w:t xml:space="preserve"> </w:t>
+      </w:r>
+      <w:r>
+        <w:t xml:space="preserve">— menyerang balik di pasar asal pesaing, sehingga pesaing harus menimbang risiko kerusakan pada bisnis intinya sendiri sebelum melancarkan serangan</w:t>
+      </w:r>
+    </w:p>
+    <w:bookmarkEnd w:id="27"/>
+    <w:bookmarkStart w:id="28" w:name="mobile-defense-dan-counteroffensive"/>
+    <w:p>
+      <w:pPr>
+        <w:pStyle w:val="Heading3"/>
+      </w:pPr>
+      <w:r>
         <w:rPr>
           <w:i/>
           <w:iCs/>
@@ -1316,8 +2144,8 @@
         <w:t xml:space="preserve">adalah respons agresif terhadap serangan: ketika pesaing menyerang, perusahaan tidak bertahan di posisi yang diserang melainkan menyerang balik di pasar inti pesaing. Logikanya adalah ekonomi politik: bila pesaing tahu serangannya akan memicu kerusakan pada bisnis intinya sendiri, ia akan berpikir dua kali sebelum melakukan serangan.</w:t>
       </w:r>
     </w:p>
-    <w:bookmarkEnd w:id="21"/>
-    <w:bookmarkStart w:id="22" w:name="barriers-to-entry-sebagai-moat"/>
+    <w:bookmarkEnd w:id="28"/>
+    <w:bookmarkStart w:id="29" w:name="barriers-to-entry-sebagai-moat"/>
     <w:p>
       <w:pPr>
         <w:pStyle w:val="Heading3"/>
@@ -1566,9 +2394,9 @@
         </w:pict>
       </w:r>
     </w:p>
-    <w:bookmarkEnd w:id="22"/>
-    <w:bookmarkEnd w:id="23"/>
-    <w:bookmarkStart w:id="29" w:name="timing-strategies"/>
+    <w:bookmarkEnd w:id="29"/>
+    <w:bookmarkEnd w:id="30"/>
+    <w:bookmarkStart w:id="37" w:name="timing-strategies"/>
     <w:p>
       <w:pPr>
         <w:pStyle w:val="Heading2"/>
@@ -1587,7 +2415,7 @@
         <w:t xml:space="preserve">Timing Strategies</w:t>
       </w:r>
     </w:p>
-    <w:bookmarkStart w:id="24" w:name="lima-mekanisme-first-mover-advantage"/>
+    <w:bookmarkStart w:id="31" w:name="lima-mekanisme-first-mover-advantage"/>
     <w:p>
       <w:pPr>
         <w:pStyle w:val="Heading3"/>
@@ -1807,8 +2635,8 @@
         <w:t xml:space="preserve">: ketika pelanggan sudah menanamkan biaya non-finansial pada platform pertama (data, kebiasaan, integrasi), biaya peralihan menjadi tinggi.</w:t>
       </w:r>
     </w:p>
-    <w:bookmarkEnd w:id="24"/>
-    <w:bookmarkStart w:id="25" w:name="tiga-beban-first-mover"/>
+    <w:bookmarkEnd w:id="31"/>
+    <w:bookmarkStart w:id="32" w:name="tiga-beban-first-mover"/>
     <w:p>
       <w:pPr>
         <w:pStyle w:val="Heading3"/>
@@ -1933,8 +2761,8 @@
         <w:t xml:space="preserve">adalah beban panjang membentuk kebiasaan pelanggan baru, yang dapat memakan waktu bertahun-tahun sebelum permintaan benar-benar matang.</w:t>
       </w:r>
     </w:p>
-    <w:bookmarkEnd w:id="25"/>
-    <w:bookmarkStart w:id="26" w:name="fast-follower-logic"/>
+    <w:bookmarkEnd w:id="32"/>
+    <w:bookmarkStart w:id="33" w:name="fast-follower-logic"/>
     <w:p>
       <w:pPr>
         <w:pStyle w:val="Heading3"/>
@@ -2058,8 +2886,8 @@
         <w:t xml:space="preserve">.</w:t>
       </w:r>
     </w:p>
-    <w:bookmarkEnd w:id="26"/>
-    <w:bookmarkStart w:id="27" w:name="late-mover-rationality"/>
+    <w:bookmarkEnd w:id="33"/>
+    <w:bookmarkStart w:id="34" w:name="late-mover-rationality"/>
     <w:p>
       <w:pPr>
         <w:pStyle w:val="Heading3"/>
@@ -2176,8 +3004,344 @@
         <w:t xml:space="preserve">di vertikal tertentu.</w:t>
       </w:r>
     </w:p>
-    <w:bookmarkEnd w:id="27"/>
-    <w:bookmarkStart w:id="28" w:name="aturan-emas-timing"/>
+    <w:bookmarkEnd w:id="34"/>
+    <w:bookmarkStart w:id="35" w:name="Xae4289fba198704f5a4f75c36896da6ece6dae7"/>
+    <w:p>
+      <w:pPr>
+        <w:pStyle w:val="Heading3"/>
+      </w:pPr>
+      <w:r>
+        <w:t xml:space="preserve">Kerangka Keputusan:</w:t>
+      </w:r>
+      <w:r>
+        <w:t xml:space="preserve"> </w:t>
+      </w:r>
+      <w:r>
+        <w:rPr>
+          <w:i/>
+          <w:iCs/>
+        </w:rPr>
+        <w:t xml:space="preserve">Early Mover</w:t>
+      </w:r>
+      <w:r>
+        <w:t xml:space="preserve"> </w:t>
+      </w:r>
+      <w:r>
+        <w:t xml:space="preserve">vs. </w:t>
+      </w:r>
+      <w:r>
+        <w:rPr>
+          <w:i/>
+          <w:iCs/>
+        </w:rPr>
+        <w:t xml:space="preserve">Late Mover</w:t>
+      </w:r>
+      <w:r>
+        <w:t xml:space="preserve"> </w:t>
+      </w:r>
+      <w:r>
+        <w:t xml:space="preserve">(TPGS Ch.6, p.156)</w:t>
+      </w:r>
+    </w:p>
+    <w:p>
+      <w:pPr>
+        <w:pStyle w:val="FirstParagraph"/>
+      </w:pPr>
+      <w:r>
+        <w:t xml:space="preserve">TPGS memberikan kerangka keputusan eksplisit untuk membantu manajer memutuskan kapan harus masuk lebih awal dan kapan menunda.</w:t>
+      </w:r>
+    </w:p>
+    <w:p>
+      <w:pPr>
+        <w:pStyle w:val="BodyText"/>
+      </w:pPr>
+      <w:r>
+        <w:rPr>
+          <w:b/>
+          <w:bCs/>
+        </w:rPr>
+        <w:t xml:space="preserve">Faktor pendukung masuk lebih awal (</w:t>
+      </w:r>
+      <w:r>
+        <w:rPr>
+          <w:b/>
+          <w:bCs/>
+          <w:i/>
+          <w:iCs/>
+        </w:rPr>
+        <w:t xml:space="preserve">early entry</w:t>
+      </w:r>
+      <w:r>
+        <w:rPr>
+          <w:b/>
+          <w:bCs/>
+        </w:rPr>
+        <w:t xml:space="preserve">):</w:t>
+      </w:r>
+    </w:p>
+    <w:p>
+      <w:pPr>
+        <w:pStyle w:val="Compact"/>
+        <w:numPr>
+          <w:ilvl w:val="0"/>
+          <w:numId w:val="1005"/>
+        </w:numPr>
+      </w:pPr>
+      <w:r>
+        <w:t xml:space="preserve">Kurva belajar yang curam — keunggulan biaya permanen dari akumulasi pengalaman</w:t>
+      </w:r>
+    </w:p>
+    <w:p>
+      <w:pPr>
+        <w:pStyle w:val="Compact"/>
+        <w:numPr>
+          <w:ilvl w:val="0"/>
+          <w:numId w:val="1005"/>
+        </w:numPr>
+      </w:pPr>
+      <w:r>
+        <w:t xml:space="preserve">Pra-emosi sumber daya langka (lokasi, bahan baku, talenta teknis)</w:t>
+      </w:r>
+    </w:p>
+    <w:p>
+      <w:pPr>
+        <w:pStyle w:val="Compact"/>
+        <w:numPr>
+          <w:ilvl w:val="0"/>
+          <w:numId w:val="1005"/>
+        </w:numPr>
+      </w:pPr>
+      <w:r>
+        <w:rPr>
+          <w:i/>
+          <w:iCs/>
+        </w:rPr>
+        <w:t xml:space="preserve">Network effects</w:t>
+      </w:r>
+      <w:r>
+        <w:t xml:space="preserve"> </w:t>
+      </w:r>
+      <w:r>
+        <w:t xml:space="preserve">— nilai platform meningkat seiring pertambahan pengguna awal</w:t>
+      </w:r>
+    </w:p>
+    <w:p>
+      <w:pPr>
+        <w:pStyle w:val="Compact"/>
+        <w:numPr>
+          <w:ilvl w:val="0"/>
+          <w:numId w:val="1005"/>
+        </w:numPr>
+      </w:pPr>
+      <w:r>
+        <w:rPr>
+          <w:i/>
+          <w:iCs/>
+        </w:rPr>
+        <w:t xml:space="preserve">Switching costs</w:t>
+      </w:r>
+      <w:r>
+        <w:t xml:space="preserve"> </w:t>
+      </w:r>
+      <w:r>
+        <w:t xml:space="preserve">yang terbentuk kuat — pelanggan pertama cenderung bertahan</w:t>
+      </w:r>
+    </w:p>
+    <w:p>
+      <w:pPr>
+        <w:pStyle w:val="Compact"/>
+        <w:numPr>
+          <w:ilvl w:val="0"/>
+          <w:numId w:val="1005"/>
+        </w:numPr>
+      </w:pPr>
+      <w:r>
+        <w:t xml:space="preserve">Preferensi merek yang terbentuk sebelum pesaing masuk</w:t>
+      </w:r>
+    </w:p>
+    <w:p>
+      <w:pPr>
+        <w:pStyle w:val="FirstParagraph"/>
+      </w:pPr>
+      <w:r>
+        <w:rPr>
+          <w:b/>
+          <w:bCs/>
+        </w:rPr>
+        <w:t xml:space="preserve">Faktor pendukung masuk lebih lambat (</w:t>
+      </w:r>
+      <w:r>
+        <w:rPr>
+          <w:b/>
+          <w:bCs/>
+          <w:i/>
+          <w:iCs/>
+        </w:rPr>
+        <w:t xml:space="preserve">late entry</w:t>
+      </w:r>
+      <w:r>
+        <w:rPr>
+          <w:b/>
+          <w:bCs/>
+        </w:rPr>
+        <w:t xml:space="preserve">):</w:t>
+      </w:r>
+    </w:p>
+    <w:p>
+      <w:pPr>
+        <w:pStyle w:val="Compact"/>
+        <w:numPr>
+          <w:ilvl w:val="0"/>
+          <w:numId w:val="1006"/>
+        </w:numPr>
+      </w:pPr>
+      <w:r>
+        <w:t xml:space="preserve">Menghindari biaya perintisan (</w:t>
+      </w:r>
+      <w:r>
+        <w:rPr>
+          <w:i/>
+          <w:iCs/>
+        </w:rPr>
+        <w:t xml:space="preserve">pioneering costs</w:t>
+      </w:r>
+      <w:r>
+        <w:t xml:space="preserve">) — edukasi pasar, kesalahan generasi awal</w:t>
+      </w:r>
+    </w:p>
+    <w:p>
+      <w:pPr>
+        <w:pStyle w:val="Compact"/>
+        <w:numPr>
+          <w:ilvl w:val="0"/>
+          <w:numId w:val="1006"/>
+        </w:numPr>
+      </w:pPr>
+      <w:r>
+        <w:t xml:space="preserve">Belajar dari kesalahan</w:t>
+      </w:r>
+      <w:r>
+        <w:t xml:space="preserve"> </w:t>
+      </w:r>
+      <w:r>
+        <w:rPr>
+          <w:i/>
+          <w:iCs/>
+        </w:rPr>
+        <w:t xml:space="preserve">early mover</w:t>
+      </w:r>
+      <w:r>
+        <w:t xml:space="preserve"> </w:t>
+      </w:r>
+      <w:r>
+        <w:t xml:space="preserve">tanpa menanggung biayanya</w:t>
+      </w:r>
+    </w:p>
+    <w:p>
+      <w:pPr>
+        <w:pStyle w:val="Compact"/>
+        <w:numPr>
+          <w:ilvl w:val="0"/>
+          <w:numId w:val="1006"/>
+        </w:numPr>
+      </w:pPr>
+      <w:r>
+        <w:rPr>
+          <w:i/>
+          <w:iCs/>
+        </w:rPr>
+        <w:t xml:space="preserve">Free-ride</w:t>
+      </w:r>
+      <w:r>
+        <w:t xml:space="preserve"> </w:t>
+      </w:r>
+      <w:r>
+        <w:t xml:space="preserve">pada edukasi pasar yang sudah dilakukan</w:t>
+      </w:r>
+      <w:r>
+        <w:t xml:space="preserve"> </w:t>
+      </w:r>
+      <w:r>
+        <w:rPr>
+          <w:i/>
+          <w:iCs/>
+        </w:rPr>
+        <w:t xml:space="preserve">early mover</w:t>
+      </w:r>
+    </w:p>
+    <w:p>
+      <w:pPr>
+        <w:pStyle w:val="Compact"/>
+        <w:numPr>
+          <w:ilvl w:val="0"/>
+          <w:numId w:val="1006"/>
+        </w:numPr>
+      </w:pPr>
+      <w:r>
+        <w:t xml:space="preserve">Melompati teknologi generasi pertama ke generasi berikutnya</w:t>
+      </w:r>
+    </w:p>
+    <w:p>
+      <w:pPr>
+        <w:pStyle w:val="Compact"/>
+        <w:numPr>
+          <w:ilvl w:val="0"/>
+          <w:numId w:val="1006"/>
+        </w:numPr>
+      </w:pPr>
+      <w:r>
+        <w:t xml:space="preserve">Pasar yang sudah teredukasi dan siap membeli dalam skala lebih besar</w:t>
+      </w:r>
+    </w:p>
+    <w:p>
+      <w:pPr>
+        <w:pStyle w:val="FirstParagraph"/>
+      </w:pPr>
+      <w:r>
+        <w:rPr>
+          <w:b/>
+          <w:bCs/>
+        </w:rPr>
+        <w:t xml:space="preserve">Aturan praktis dari kerangka ini</w:t>
+      </w:r>
+      <w:r>
+        <w:t xml:space="preserve">: semakin banyak faktor pendukung</w:t>
+      </w:r>
+      <w:r>
+        <w:t xml:space="preserve"> </w:t>
+      </w:r>
+      <w:r>
+        <w:rPr>
+          <w:i/>
+          <w:iCs/>
+        </w:rPr>
+        <w:t xml:space="preserve">early entry</w:t>
+      </w:r>
+      <w:r>
+        <w:t xml:space="preserve"> </w:t>
+      </w:r>
+      <w:r>
+        <w:t xml:space="preserve">yang aktif di industri tertentu, semakin tinggi kerugian menunggu; sebaliknya, semakin banyak faktor</w:t>
+      </w:r>
+      <w:r>
+        <w:t xml:space="preserve"> </w:t>
+      </w:r>
+      <w:r>
+        <w:rPr>
+          <w:i/>
+          <w:iCs/>
+        </w:rPr>
+        <w:t xml:space="preserve">late entry</w:t>
+      </w:r>
+      <w:r>
+        <w:t xml:space="preserve"> </w:t>
+      </w:r>
+      <w:r>
+        <w:t xml:space="preserve">yang aktif, semakin tinggi kerugian terburu-buru masuk.</w:t>
+      </w:r>
+    </w:p>
+    <w:bookmarkEnd w:id="35"/>
+    <w:bookmarkStart w:id="36" w:name="aturan-emas-timing"/>
     <w:p>
       <w:pPr>
         <w:pStyle w:val="Heading3"/>
@@ -2377,9 +3541,9 @@
         </w:pict>
       </w:r>
     </w:p>
-    <w:bookmarkEnd w:id="28"/>
-    <w:bookmarkEnd w:id="29"/>
-    <w:bookmarkStart w:id="35" w:name="scope-of-operations"/>
+    <w:bookmarkEnd w:id="36"/>
+    <w:bookmarkEnd w:id="37"/>
+    <w:bookmarkStart w:id="54" w:name="scope-of-operations"/>
     <w:p>
       <w:pPr>
         <w:pStyle w:val="Heading2"/>
@@ -2398,7 +3562,7 @@
         <w:t xml:space="preserve">Scope of Operations</w:t>
       </w:r>
     </w:p>
-    <w:bookmarkStart w:id="30" w:name="vertical-integration"/>
+    <w:bookmarkStart w:id="41" w:name="vertical-integration"/>
     <w:p>
       <w:pPr>
         <w:pStyle w:val="Heading3"/>
@@ -2490,13 +3654,337 @@
         <w:t xml:space="preserve">; biayanya adalah hilangnya fleksibilitas dan beban modal yang tinggi.</w:t>
       </w:r>
     </w:p>
-    <w:bookmarkEnd w:id="30"/>
-    <w:bookmarkStart w:id="31" w:name="X3f4d0bb6dd1de3474563032100f11f1fd998a65"/>
+    <w:p>
+      <w:pPr>
+        <w:pStyle w:val="CaptionedFigure"/>
+      </w:pPr>
+      <w:r>
+        <w:drawing>
+          <wp:inline>
+            <wp:extent cx="5791200" cy="7155500"/>
+            <wp:effectExtent b="0" l="0" r="0" t="0"/>
+            <wp:docPr descr="Gambar 6.2 — Concepts &amp; Connections 6.3: Tesla’s Vertical Integration Strategy" title="" id="39" name="Picture"/>
+            <a:graphic>
+              <a:graphicData uri="http://schemas.openxmlformats.org/drawingml/2006/picture">
+                <pic:pic>
+                  <pic:nvPicPr>
+                    <pic:cNvPr descr="D:/DZAKI/S2/Sem.%201/Manajemen%20Strategik/Dev%20Assistant/temp/ch6_figures/cc_6_3_tesla.png" id="40" name="Picture"/>
+                    <pic:cNvPicPr>
+                      <a:picLocks noChangeArrowheads="1" noChangeAspect="1"/>
+                    </pic:cNvPicPr>
+                  </pic:nvPicPr>
+                  <pic:blipFill>
+                    <a:blip r:embed="rId38"/>
+                    <a:stretch>
+                      <a:fillRect/>
+                    </a:stretch>
+                  </pic:blipFill>
+                  <pic:spPr bwMode="auto">
+                    <a:xfrm>
+                      <a:off x="0" y="0"/>
+                      <a:ext cx="5791200" cy="7155500"/>
+                    </a:xfrm>
+                    <a:prstGeom prst="rect">
+                      <a:avLst/>
+                    </a:prstGeom>
+                    <a:noFill/>
+                    <a:ln w="9525">
+                      <a:noFill/>
+                      <a:headEnd/>
+                      <a:tailEnd/>
+                    </a:ln>
+                  </pic:spPr>
+                </pic:pic>
+              </a:graphicData>
+            </a:graphic>
+          </wp:inline>
+        </w:drawing>
+      </w:r>
+    </w:p>
+    <w:p>
+      <w:pPr>
+        <w:pStyle w:val="ImageCaption"/>
+      </w:pPr>
+      <w:r>
+        <w:rPr>
+          <w:i/>
+          <w:iCs/>
+        </w:rPr>
+        <w:t xml:space="preserve">Gambar 6.2 — Concepts &amp; Connections 6.3: Tesla’s Vertical Integration Strategy</w:t>
+      </w:r>
+    </w:p>
+    <w:p>
+      <w:pPr>
+        <w:pStyle w:val="BodyText"/>
+      </w:pPr>
+      <w:r>
+        <w:rPr>
+          <w:i/>
+          <w:iCs/>
+        </w:rPr>
+        <w:t xml:space="preserve">Sumber: Gamble, Thompson &amp; Peteraf (2021), Essentials of Strategic Management, Ch.6, p.124</w:t>
+      </w:r>
+    </w:p>
+    <w:bookmarkEnd w:id="41"/>
+    <w:bookmarkStart w:id="42" w:name="Xc63eba448107b69afbd7d118446138512a544b2"/>
     <w:p>
       <w:pPr>
         <w:pStyle w:val="Heading3"/>
       </w:pPr>
       <w:r>
+        <w:t xml:space="preserve">Empat Keunggulan Integrasi Vertikal (TPGS Ch.6, p.161–162)</w:t>
+      </w:r>
+    </w:p>
+    <w:p>
+      <w:pPr>
+        <w:pStyle w:val="FirstParagraph"/>
+      </w:pPr>
+      <w:r>
+        <w:t xml:space="preserve">TPGS menyusun empat keunggulan strategik integrasi vertikal yang menjelaskan mengapa perusahaan seperti Tesla bersedia menanggung beban modal yang tinggi:</w:t>
+      </w:r>
+    </w:p>
+    <w:p>
+      <w:pPr>
+        <w:pStyle w:val="Compact"/>
+        <w:numPr>
+          <w:ilvl w:val="0"/>
+          <w:numId w:val="1007"/>
+        </w:numPr>
+      </w:pPr>
+      <w:r>
+        <w:rPr>
+          <w:b/>
+          <w:bCs/>
+        </w:rPr>
+        <w:t xml:space="preserve">Memperkuat diferensiasi dan keunggulan kompetitif</w:t>
+      </w:r>
+      <w:r>
+        <w:t xml:space="preserve"> </w:t>
+      </w:r>
+      <w:r>
+        <w:t xml:space="preserve">— kontrol atas proses hulu/hilir memungkinkan konsistensi kualitas yang sulit ditiru pesaing</w:t>
+      </w:r>
+    </w:p>
+    <w:p>
+      <w:pPr>
+        <w:pStyle w:val="Compact"/>
+        <w:numPr>
+          <w:ilvl w:val="0"/>
+          <w:numId w:val="1007"/>
+        </w:numPr>
+      </w:pPr>
+      <w:r>
+        <w:rPr>
+          <w:b/>
+          <w:bCs/>
+        </w:rPr>
+        <w:t xml:space="preserve">Mengurangi ketergantungan pada pemasok yang kuat</w:t>
+      </w:r>
+      <w:r>
+        <w:t xml:space="preserve"> </w:t>
+      </w:r>
+      <w:r>
+        <w:t xml:space="preserve">— eliminasi</w:t>
+      </w:r>
+      <w:r>
+        <w:t xml:space="preserve"> </w:t>
+      </w:r>
+      <w:r>
+        <w:rPr>
+          <w:i/>
+          <w:iCs/>
+        </w:rPr>
+        <w:t xml:space="preserve">supplier bargaining power</w:t>
+      </w:r>
+      <w:r>
+        <w:t xml:space="preserve"> </w:t>
+      </w:r>
+      <w:r>
+        <w:t xml:space="preserve">dalam analisis Five Forces</w:t>
+      </w:r>
+    </w:p>
+    <w:p>
+      <w:pPr>
+        <w:pStyle w:val="Compact"/>
+        <w:numPr>
+          <w:ilvl w:val="0"/>
+          <w:numId w:val="1007"/>
+        </w:numPr>
+      </w:pPr>
+      <w:r>
+        <w:rPr>
+          <w:b/>
+          <w:bCs/>
+        </w:rPr>
+        <w:t xml:space="preserve">Mengurangi ketergantungan pada pembeli yang kuat</w:t>
+      </w:r>
+      <w:r>
+        <w:t xml:space="preserve"> </w:t>
+      </w:r>
+      <w:r>
+        <w:t xml:space="preserve">— kepemilikan saluran distribusi sendiri menghilangkan</w:t>
+      </w:r>
+      <w:r>
+        <w:t xml:space="preserve"> </w:t>
+      </w:r>
+      <w:r>
+        <w:rPr>
+          <w:i/>
+          <w:iCs/>
+        </w:rPr>
+        <w:t xml:space="preserve">leverage</w:t>
+      </w:r>
+      <w:r>
+        <w:t xml:space="preserve"> </w:t>
+      </w:r>
+      <w:r>
+        <w:t xml:space="preserve">pembeli besar</w:t>
+      </w:r>
+    </w:p>
+    <w:p>
+      <w:pPr>
+        <w:pStyle w:val="Compact"/>
+        <w:numPr>
+          <w:ilvl w:val="0"/>
+          <w:numId w:val="1007"/>
+        </w:numPr>
+      </w:pPr>
+      <w:r>
+        <w:rPr>
+          <w:b/>
+          <w:bCs/>
+        </w:rPr>
+        <w:t xml:space="preserve">Membangun</w:t>
+      </w:r>
+      <w:r>
+        <w:rPr>
+          <w:b/>
+          <w:bCs/>
+        </w:rPr>
+        <w:t xml:space="preserve"> </w:t>
+      </w:r>
+      <w:r>
+        <w:rPr>
+          <w:b/>
+          <w:bCs/>
+          <w:i/>
+          <w:iCs/>
+        </w:rPr>
+        <w:t xml:space="preserve">barriers to entry</w:t>
+      </w:r>
+      <w:r>
+        <w:t xml:space="preserve"> </w:t>
+      </w:r>
+      <w:r>
+        <w:t xml:space="preserve">— biaya dan kompleksitas menduplikasi rantai vertikal terintegrasi sangat tinggi bagi calon pendatang baru</w:t>
+      </w:r>
+    </w:p>
+    <w:bookmarkEnd w:id="42"/>
+    <w:bookmarkStart w:id="43" w:name="X1cd32d7c6fefc1869f56e827c37a63e6e98d4ab"/>
+    <w:p>
+      <w:pPr>
+        <w:pStyle w:val="Heading3"/>
+      </w:pPr>
+      <w:r>
+        <w:t xml:space="preserve">Tiga Kelemahan Integrasi Vertikal (TPGS Ch.6, p.163)</w:t>
+      </w:r>
+    </w:p>
+    <w:p>
+      <w:pPr>
+        <w:pStyle w:val="FirstParagraph"/>
+      </w:pPr>
+      <w:r>
+        <w:t xml:space="preserve">Sebagai penyeimbang, TPGS juga menyebut tiga kelemahan struktural yang membuat integrasi vertikal tidak selalu pilihan optimal:</w:t>
+      </w:r>
+    </w:p>
+    <w:p>
+      <w:pPr>
+        <w:pStyle w:val="Compact"/>
+        <w:numPr>
+          <w:ilvl w:val="0"/>
+          <w:numId w:val="1008"/>
+        </w:numPr>
+      </w:pPr>
+      <w:r>
+        <w:rPr>
+          <w:b/>
+          <w:bCs/>
+        </w:rPr>
+        <w:t xml:space="preserve">Meningkatkan investasi modal dan risiko bisnis</w:t>
+      </w:r>
+      <w:r>
+        <w:t xml:space="preserve"> </w:t>
+      </w:r>
+      <w:r>
+        <w:t xml:space="preserve">— semakin banyak rantai yang dimiliki, semakin besar eksposur terhadap siklus industri secara keseluruhan</w:t>
+      </w:r>
+    </w:p>
+    <w:p>
+      <w:pPr>
+        <w:pStyle w:val="Compact"/>
+        <w:numPr>
+          <w:ilvl w:val="0"/>
+          <w:numId w:val="1008"/>
+        </w:numPr>
+      </w:pPr>
+      <w:r>
+        <w:rPr>
+          <w:b/>
+          <w:bCs/>
+        </w:rPr>
+        <w:t xml:space="preserve">Membatasi fleksibilitas strategis</w:t>
+      </w:r>
+      <w:r>
+        <w:t xml:space="preserve"> </w:t>
+      </w:r>
+      <w:r>
+        <w:t xml:space="preserve">— sulit beralih pemasok atau pembeli jika teknologi atau pasar berubah arah</w:t>
+      </w:r>
+    </w:p>
+    <w:p>
+      <w:pPr>
+        <w:pStyle w:val="Compact"/>
+        <w:numPr>
+          <w:ilvl w:val="0"/>
+          <w:numId w:val="1008"/>
+        </w:numPr>
+      </w:pPr>
+      <w:r>
+        <w:rPr>
+          <w:b/>
+          <w:bCs/>
+        </w:rPr>
+        <w:t xml:space="preserve">Mungkin tidak kompetitif secara biaya</w:t>
+      </w:r>
+      <w:r>
+        <w:t xml:space="preserve"> </w:t>
+      </w:r>
+      <w:r>
+        <w:t xml:space="preserve">— operasi internal yang tidak mencapai skala minimum menjadi lebih mahal daripada menggunakan spesialis eksternal</w:t>
+      </w:r>
+    </w:p>
+    <w:p>
+      <w:pPr>
+        <w:pStyle w:val="FirstParagraph"/>
+      </w:pPr>
+      <w:r>
+        <w:rPr>
+          <w:b/>
+          <w:bCs/>
+        </w:rPr>
+        <w:t xml:space="preserve">Kesimpulan praktis</w:t>
+      </w:r>
+      <w:r>
+        <w:t xml:space="preserve">: integrasi vertikal masuk akal hanya ketika empat keunggulan secara nyata dapat diaktifkan dan tiga kelemahan dapat diserap — bukan sekadar ketika kontrol penuh atas rantai nilai terdengar menarik.</w:t>
+      </w:r>
+    </w:p>
+    <w:bookmarkEnd w:id="43"/>
+    <w:bookmarkStart w:id="44" w:name="X3f4d0bb6dd1de3474563032100f11f1fd998a65"/>
+    <w:p>
+      <w:pPr>
+        <w:pStyle w:val="Heading3"/>
+      </w:pPr>
+      <w:r>
         <w:rPr>
           <w:i/>
           <w:iCs/>
@@ -2609,8 +4097,8 @@
         <w:t xml:space="preserve">yang menjadi sumber inovasi juga ikut hilang. Kapabilitas yang sudah hilang sangat sulit dibangun kembali.</w:t>
       </w:r>
     </w:p>
-    <w:bookmarkEnd w:id="31"/>
-    <w:bookmarkStart w:id="32" w:name="strategic-alliances-dan-joint-ventures"/>
+    <w:bookmarkEnd w:id="44"/>
+    <w:bookmarkStart w:id="45" w:name="strategic-alliances-dan-joint-ventures"/>
     <w:p>
       <w:pPr>
         <w:pStyle w:val="Heading3"/>
@@ -2741,13 +4229,289 @@
         <w:t xml:space="preserve">: aliansi memberi kecepatan dan akses pembelajaran tetapi mengorbankan kontrol; akuisisi memberi kontrol penuh tetapi memerlukan modal dan integrasi yang mahal.</w:t>
       </w:r>
     </w:p>
-    <w:bookmarkEnd w:id="32"/>
-    <w:bookmarkStart w:id="33" w:name="mergers-acquisitions"/>
+    <w:bookmarkEnd w:id="45"/>
+    <w:bookmarkStart w:id="46" w:name="Xbbc03a969652c2d0949396beef0cc616930582d"/>
     <w:p>
       <w:pPr>
         <w:pStyle w:val="Heading3"/>
       </w:pPr>
       <w:r>
+        <w:t xml:space="preserve">Mengapa Aliansi Strategis Gagal (TPGS Ch.6, p.166)</w:t>
+      </w:r>
+    </w:p>
+    <w:p>
+      <w:pPr>
+        <w:pStyle w:val="FirstParagraph"/>
+      </w:pPr>
+      <w:r>
+        <w:t xml:space="preserve">TPGS mengidentifikasi</w:t>
+      </w:r>
+      <w:r>
+        <w:t xml:space="preserve"> </w:t>
+      </w:r>
+      <w:r>
+        <w:rPr>
+          <w:b/>
+          <w:bCs/>
+        </w:rPr>
+        <w:t xml:space="preserve">lima penyebab kegagalan aliansi</w:t>
+      </w:r>
+      <w:r>
+        <w:t xml:space="preserve">:</w:t>
+      </w:r>
+    </w:p>
+    <w:p>
+      <w:pPr>
+        <w:pStyle w:val="Compact"/>
+        <w:numPr>
+          <w:ilvl w:val="0"/>
+          <w:numId w:val="1009"/>
+        </w:numPr>
+      </w:pPr>
+      <w:r>
+        <w:rPr>
+          <w:b/>
+          <w:bCs/>
+        </w:rPr>
+        <w:t xml:space="preserve">Tujuan yang berubah seiring waktu</w:t>
+      </w:r>
+      <w:r>
+        <w:t xml:space="preserve"> </w:t>
+      </w:r>
+      <w:r>
+        <w:t xml:space="preserve">— kepentingan mitra yang awalnya selaras berevolusi ke arah yang berbeda</w:t>
+      </w:r>
+    </w:p>
+    <w:p>
+      <w:pPr>
+        <w:pStyle w:val="Compact"/>
+        <w:numPr>
+          <w:ilvl w:val="0"/>
+          <w:numId w:val="1009"/>
+        </w:numPr>
+      </w:pPr>
+      <w:r>
+        <w:rPr>
+          <w:b/>
+          <w:bCs/>
+        </w:rPr>
+        <w:t xml:space="preserve">Hilangnya sensitivitas kompetitif</w:t>
+      </w:r>
+      <w:r>
+        <w:t xml:space="preserve"> </w:t>
+      </w:r>
+      <w:r>
+        <w:t xml:space="preserve">— berbagi informasi</w:t>
+      </w:r>
+      <w:r>
+        <w:t xml:space="preserve"> </w:t>
+      </w:r>
+      <w:r>
+        <w:rPr>
+          <w:i/>
+          <w:iCs/>
+        </w:rPr>
+        <w:t xml:space="preserve">proprietary</w:t>
+      </w:r>
+      <w:r>
+        <w:t xml:space="preserve"> </w:t>
+      </w:r>
+      <w:r>
+        <w:t xml:space="preserve">menciptakan risiko transfer pengetahuan kepada pesaing</w:t>
+      </w:r>
+    </w:p>
+    <w:p>
+      <w:pPr>
+        <w:pStyle w:val="Compact"/>
+        <w:numPr>
+          <w:ilvl w:val="0"/>
+          <w:numId w:val="1009"/>
+        </w:numPr>
+      </w:pPr>
+      <w:r>
+        <w:rPr>
+          <w:b/>
+          <w:bCs/>
+          <w:i/>
+          <w:iCs/>
+        </w:rPr>
+        <w:t xml:space="preserve">Free-riding</w:t>
+      </w:r>
+      <w:r>
+        <w:t xml:space="preserve"> </w:t>
+      </w:r>
+      <w:r>
+        <w:t xml:space="preserve">— satu pihak mendapat manfaat lebih besar dari kontribusinya; asimetri ini merusak kepercayaan</w:t>
+      </w:r>
+    </w:p>
+    <w:p>
+      <w:pPr>
+        <w:pStyle w:val="Compact"/>
+        <w:numPr>
+          <w:ilvl w:val="0"/>
+          <w:numId w:val="1009"/>
+        </w:numPr>
+      </w:pPr>
+      <w:r>
+        <w:rPr>
+          <w:b/>
+          <w:bCs/>
+        </w:rPr>
+        <w:t xml:space="preserve">Ketidakpercayaan dari berbagi pengetahuan</w:t>
+      </w:r>
+      <w:r>
+        <w:t xml:space="preserve"> </w:t>
+      </w:r>
+      <w:r>
+        <w:t xml:space="preserve">— setelah IP dibagikan, sulit dilindungi kembali jika aliansi putus</w:t>
+      </w:r>
+    </w:p>
+    <w:p>
+      <w:pPr>
+        <w:pStyle w:val="Compact"/>
+        <w:numPr>
+          <w:ilvl w:val="0"/>
+          <w:numId w:val="1009"/>
+        </w:numPr>
+      </w:pPr>
+      <w:r>
+        <w:rPr>
+          <w:b/>
+          <w:bCs/>
+        </w:rPr>
+        <w:t xml:space="preserve">Koordinasi lintas budaya yang sulit</w:t>
+      </w:r>
+      <w:r>
+        <w:t xml:space="preserve"> </w:t>
+      </w:r>
+      <w:r>
+        <w:t xml:space="preserve">— perbedaan sistem manajemen, bahasa, dan ekspektasi menciptakan friksi operasional</w:t>
+      </w:r>
+    </w:p>
+    <w:bookmarkEnd w:id="46"/>
+    <w:bookmarkStart w:id="47" w:name="X7512a3574f57a3c08f58975f99aa8e162bf4075"/>
+    <w:p>
+      <w:pPr>
+        <w:pStyle w:val="Heading3"/>
+      </w:pPr>
+      <w:r>
+        <w:t xml:space="preserve">Bahaya Mengandalkan Aliansi untuk Kapabilitas Esensial (TPGS Ch.6, p.167)</w:t>
+      </w:r>
+    </w:p>
+    <w:p>
+      <w:pPr>
+        <w:pStyle w:val="FirstParagraph"/>
+      </w:pPr>
+      <w:r>
+        <w:rPr>
+          <w:b/>
+          <w:bCs/>
+        </w:rPr>
+        <w:t xml:space="preserve">Risiko</w:t>
+      </w:r>
+      <w:r>
+        <w:rPr>
+          <w:b/>
+          <w:bCs/>
+        </w:rPr>
+        <w:t xml:space="preserve"> </w:t>
+      </w:r>
+      <w:r>
+        <w:rPr>
+          <w:b/>
+          <w:bCs/>
+        </w:rPr>
+        <w:t xml:space="preserve">“pengosongan kapabilitas”</w:t>
+      </w:r>
+      <w:r>
+        <w:rPr>
+          <w:b/>
+          <w:bCs/>
+        </w:rPr>
+        <w:t xml:space="preserve"> </w:t>
+      </w:r>
+      <w:r>
+        <w:rPr>
+          <w:b/>
+          <w:bCs/>
+        </w:rPr>
+        <w:t xml:space="preserve">(</w:t>
+      </w:r>
+      <w:r>
+        <w:rPr>
+          <w:b/>
+          <w:bCs/>
+          <w:i/>
+          <w:iCs/>
+        </w:rPr>
+        <w:t xml:space="preserve">hollowing out</w:t>
+      </w:r>
+      <w:r>
+        <w:rPr>
+          <w:b/>
+          <w:bCs/>
+        </w:rPr>
+        <w:t xml:space="preserve">)</w:t>
+      </w:r>
+      <w:r>
+        <w:t xml:space="preserve"> </w:t>
+      </w:r>
+      <w:r>
+        <w:t xml:space="preserve">adalah yang paling berbahaya dalam jangka panjang. TPGS memperingatkan: jika perusahaan secara konsisten mengandalkan aliansi untuk kapabilitas inti, perusahaan tersebut secara bertahap kehilangan kemampuan untuk membangun kembali kapabilitas itu secara internal ketika aliansi berakhir.</w:t>
+      </w:r>
+      <w:r>
+        <w:t xml:space="preserve"> </w:t>
+      </w:r>
+      <w:r>
+        <w:rPr>
+          <w:b/>
+          <w:bCs/>
+        </w:rPr>
+        <w:t xml:space="preserve">Prinsip</w:t>
+      </w:r>
+      <w:r>
+        <w:t xml:space="preserve">: aliansi boleh digunakan untuk</w:t>
+      </w:r>
+      <w:r>
+        <w:t xml:space="preserve"> </w:t>
+      </w:r>
+      <w:r>
+        <w:rPr>
+          <w:i/>
+          <w:iCs/>
+        </w:rPr>
+        <w:t xml:space="preserve">akses</w:t>
+      </w:r>
+      <w:r>
+        <w:t xml:space="preserve"> </w:t>
+      </w:r>
+      <w:r>
+        <w:t xml:space="preserve">kapabilitas secara cepat, tetapi tidak boleh menggantikan</w:t>
+      </w:r>
+      <w:r>
+        <w:t xml:space="preserve"> </w:t>
+      </w:r>
+      <w:r>
+        <w:rPr>
+          <w:i/>
+          <w:iCs/>
+        </w:rPr>
+        <w:t xml:space="preserve">pembangunan</w:t>
+      </w:r>
+      <w:r>
+        <w:t xml:space="preserve"> </w:t>
+      </w:r>
+      <w:r>
+        <w:t xml:space="preserve">kapabilitas internal jangka panjang.</w:t>
+      </w:r>
+    </w:p>
+    <w:bookmarkEnd w:id="47"/>
+    <w:bookmarkStart w:id="51" w:name="mergers-acquisitions"/>
+    <w:p>
+      <w:pPr>
+        <w:pStyle w:val="Heading3"/>
+      </w:pPr>
+      <w:r>
         <w:rPr>
           <w:i/>
           <w:iCs/>
@@ -2789,8 +4553,258 @@
         <w:t xml:space="preserve">yang saling melengkapi digabungkan untuk menciptakan ekosistem digital end-to-end. Logikanya adalah skala, sinergi, dan posisi defensif terhadap pemain global. Risiko M&amp;A adalah eksekusi integrasi: literatur menunjukkan mayoritas merger gagal menciptakan nilai karena masalah integrasi budaya, sistem, dan insentif yang diremehkan dalam fase deal-making.</w:t>
       </w:r>
     </w:p>
-    <w:bookmarkEnd w:id="33"/>
-    <w:bookmarkStart w:id="34" w:name="X7c5401c2468faf09c2838e34c7da5ca1f3b0f2b"/>
+    <w:p>
+      <w:pPr>
+        <w:pStyle w:val="CaptionedFigure"/>
+      </w:pPr>
+      <w:r>
+        <w:drawing>
+          <wp:inline>
+            <wp:extent cx="5791200" cy="7155500"/>
+            <wp:effectExtent b="0" l="0" r="0" t="0"/>
+            <wp:docPr descr="Gambar 6.3 — Concepts &amp; Connections 6.2: Walmart’s Acquisition of Jet.com" title="" id="49" name="Picture"/>
+            <a:graphic>
+              <a:graphicData uri="http://schemas.openxmlformats.org/drawingml/2006/picture">
+                <pic:pic>
+                  <pic:nvPicPr>
+                    <pic:cNvPr descr="D:/DZAKI/S2/Sem.%201/Manajemen%20Strategik/Dev%20Assistant/temp/ch6_figures/cc_6_2_walmart.png" id="50" name="Picture"/>
+                    <pic:cNvPicPr>
+                      <a:picLocks noChangeArrowheads="1" noChangeAspect="1"/>
+                    </pic:cNvPicPr>
+                  </pic:nvPicPr>
+                  <pic:blipFill>
+                    <a:blip r:embed="rId48"/>
+                    <a:stretch>
+                      <a:fillRect/>
+                    </a:stretch>
+                  </pic:blipFill>
+                  <pic:spPr bwMode="auto">
+                    <a:xfrm>
+                      <a:off x="0" y="0"/>
+                      <a:ext cx="5791200" cy="7155500"/>
+                    </a:xfrm>
+                    <a:prstGeom prst="rect">
+                      <a:avLst/>
+                    </a:prstGeom>
+                    <a:noFill/>
+                    <a:ln w="9525">
+                      <a:noFill/>
+                      <a:headEnd/>
+                      <a:tailEnd/>
+                    </a:ln>
+                  </pic:spPr>
+                </pic:pic>
+              </a:graphicData>
+            </a:graphic>
+          </wp:inline>
+        </w:drawing>
+      </w:r>
+    </w:p>
+    <w:p>
+      <w:pPr>
+        <w:pStyle w:val="ImageCaption"/>
+      </w:pPr>
+      <w:r>
+        <w:rPr>
+          <w:i/>
+          <w:iCs/>
+        </w:rPr>
+        <w:t xml:space="preserve">Gambar 6.3 — Concepts &amp; Connections 6.2: Walmart’s Acquisition of Jet.com</w:t>
+      </w:r>
+    </w:p>
+    <w:p>
+      <w:pPr>
+        <w:pStyle w:val="BodyText"/>
+      </w:pPr>
+      <w:r>
+        <w:rPr>
+          <w:i/>
+          <w:iCs/>
+        </w:rPr>
+        <w:t xml:space="preserve">Sumber: Gamble, Thompson &amp; Peteraf (2021), Essentials of Strategic Management, Ch.6, p.120</w:t>
+      </w:r>
+    </w:p>
+    <w:bookmarkEnd w:id="51"/>
+    <w:bookmarkStart w:id="52" w:name="X685179180e0ef6aee26c3afecaab8c9d2329a22"/>
+    <w:p>
+      <w:pPr>
+        <w:pStyle w:val="Heading3"/>
+      </w:pPr>
+      <w:r>
+        <w:t xml:space="preserve">Mengapa M&amp;A Sering Gagal Memenuhi Ekspektasi (TPGS Ch.6, p.159)</w:t>
+      </w:r>
+    </w:p>
+    <w:p>
+      <w:pPr>
+        <w:pStyle w:val="FirstParagraph"/>
+      </w:pPr>
+      <w:r>
+        <w:t xml:space="preserve">TPGS mengidentifikasi</w:t>
+      </w:r>
+      <w:r>
+        <w:t xml:space="preserve"> </w:t>
+      </w:r>
+      <w:r>
+        <w:rPr>
+          <w:b/>
+          <w:bCs/>
+        </w:rPr>
+        <w:t xml:space="preserve">lima penyebab utama kegagalan M&amp;A</w:t>
+      </w:r>
+      <w:r>
+        <w:t xml:space="preserve">:</w:t>
+      </w:r>
+    </w:p>
+    <w:p>
+      <w:pPr>
+        <w:pStyle w:val="Compact"/>
+        <w:numPr>
+          <w:ilvl w:val="0"/>
+          <w:numId w:val="1010"/>
+        </w:numPr>
+      </w:pPr>
+      <w:r>
+        <w:rPr>
+          <w:b/>
+          <w:bCs/>
+        </w:rPr>
+        <w:t xml:space="preserve">Melebih-estimasi sinergi</w:t>
+      </w:r>
+      <w:r>
+        <w:t xml:space="preserve"> </w:t>
+      </w:r>
+      <w:r>
+        <w:t xml:space="preserve">(</w:t>
+      </w:r>
+      <w:r>
+        <w:rPr>
+          <w:i/>
+          <w:iCs/>
+        </w:rPr>
+        <w:t xml:space="preserve">overestimating synergies</w:t>
+      </w:r>
+      <w:r>
+        <w:t xml:space="preserve">) — integrasi lebih sulit dari proyeksi; penghematan biaya tidak terealisasi penuh dalam praktik —</w:t>
+      </w:r>
+      <w:r>
+        <w:t xml:space="preserve"> </w:t>
+      </w:r>
+      <w:r>
+        <w:rPr>
+          <w:b/>
+          <w:bCs/>
+        </w:rPr>
+        <w:t xml:space="preserve">faktor paling umum</w:t>
+      </w:r>
+    </w:p>
+    <w:p>
+      <w:pPr>
+        <w:pStyle w:val="Compact"/>
+        <w:numPr>
+          <w:ilvl w:val="0"/>
+          <w:numId w:val="1010"/>
+        </w:numPr>
+      </w:pPr>
+      <w:r>
+        <w:rPr>
+          <w:b/>
+          <w:bCs/>
+        </w:rPr>
+        <w:t xml:space="preserve">Kesulitan integrasi operasional</w:t>
+      </w:r>
+      <w:r>
+        <w:t xml:space="preserve"> </w:t>
+      </w:r>
+      <w:r>
+        <w:t xml:space="preserve">— sistem IT, proses kerja, dan struktur organisasi tidak mudah digabungkan tanpa gangguan kinerja</w:t>
+      </w:r>
+    </w:p>
+    <w:p>
+      <w:pPr>
+        <w:pStyle w:val="Compact"/>
+        <w:numPr>
+          <w:ilvl w:val="0"/>
+          <w:numId w:val="1010"/>
+        </w:numPr>
+      </w:pPr>
+      <w:r>
+        <w:rPr>
+          <w:b/>
+          <w:bCs/>
+          <w:i/>
+          <w:iCs/>
+        </w:rPr>
+        <w:t xml:space="preserve">Culture clash</w:t>
+      </w:r>
+      <w:r>
+        <w:t xml:space="preserve"> </w:t>
+      </w:r>
+      <w:r>
+        <w:t xml:space="preserve">— perbedaan nilai, gaya manajemen, dan cara kerja yang tidak terselesaikan menciptakan friksi jangka panjang</w:t>
+      </w:r>
+    </w:p>
+    <w:p>
+      <w:pPr>
+        <w:pStyle w:val="Compact"/>
+        <w:numPr>
+          <w:ilvl w:val="0"/>
+          <w:numId w:val="1010"/>
+        </w:numPr>
+      </w:pPr>
+      <w:r>
+        <w:rPr>
+          <w:b/>
+          <w:bCs/>
+        </w:rPr>
+        <w:t xml:space="preserve">Membayar premi terlalu tinggi</w:t>
+      </w:r>
+      <w:r>
+        <w:t xml:space="preserve"> </w:t>
+      </w:r>
+      <w:r>
+        <w:t xml:space="preserve">—</w:t>
+      </w:r>
+      <w:r>
+        <w:t xml:space="preserve"> </w:t>
+      </w:r>
+      <w:r>
+        <w:rPr>
+          <w:i/>
+          <w:iCs/>
+        </w:rPr>
+        <w:t xml:space="preserve">winner’s curse</w:t>
+      </w:r>
+      <w:r>
+        <w:t xml:space="preserve"> </w:t>
+      </w:r>
+      <w:r>
+        <w:t xml:space="preserve">dalam proses lelang akuisisi kompetitif</w:t>
+      </w:r>
+    </w:p>
+    <w:p>
+      <w:pPr>
+        <w:pStyle w:val="Compact"/>
+        <w:numPr>
+          <w:ilvl w:val="0"/>
+          <w:numId w:val="1010"/>
+        </w:numPr>
+      </w:pPr>
+      <w:r>
+        <w:rPr>
+          <w:b/>
+          <w:bCs/>
+        </w:rPr>
+        <w:t xml:space="preserve">Gangguan fokus manajemen</w:t>
+      </w:r>
+      <w:r>
+        <w:t xml:space="preserve"> </w:t>
+      </w:r>
+      <w:r>
+        <w:t xml:space="preserve">— eksekutif terlalu fokus pada integrasi, mengabaikan ancaman dan peluang di bisnis inti</w:t>
+      </w:r>
+    </w:p>
+    <w:bookmarkEnd w:id="52"/>
+    <w:bookmarkStart w:id="53" w:name="X7c5401c2468faf09c2838e34c7da5ca1f3b0f2b"/>
     <w:p>
       <w:pPr>
         <w:pStyle w:val="Heading3"/>
@@ -2955,9 +4969,9 @@
         </w:pict>
       </w:r>
     </w:p>
-    <w:bookmarkEnd w:id="34"/>
-    <w:bookmarkEnd w:id="35"/>
-    <w:bookmarkStart w:id="40" w:name="blue-ocean-strategy"/>
+    <w:bookmarkEnd w:id="53"/>
+    <w:bookmarkEnd w:id="54"/>
+    <w:bookmarkStart w:id="62" w:name="blue-ocean-strategy"/>
     <w:p>
       <w:pPr>
         <w:pStyle w:val="Heading2"/>
@@ -2976,7 +4990,7 @@
         <w:t xml:space="preserve">Blue Ocean Strategy</w:t>
       </w:r>
     </w:p>
-    <w:bookmarkStart w:id="36" w:name="Xcc405d6730233a688decd7bd2dd5a1c0d812cdf"/>
+    <w:bookmarkStart w:id="55" w:name="Xcc405d6730233a688decd7bd2dd5a1c0d812cdf"/>
     <w:p>
       <w:pPr>
         <w:pStyle w:val="Heading3"/>
@@ -3106,8 +5120,8 @@
         <w:t xml:space="preserve">) di mana persaingan belum terbentuk, dengan menawarkan kombinasi nilai yang sebelumnya tidak dianggap mungkin.</w:t>
       </w:r>
     </w:p>
-    <w:bookmarkEnd w:id="36"/>
-    <w:bookmarkStart w:id="37" w:name="eliminate-reduce-raise-create-grid"/>
+    <w:bookmarkEnd w:id="55"/>
+    <w:bookmarkStart w:id="59" w:name="eliminate-reduce-raise-create-grid"/>
     <w:p>
       <w:pPr>
         <w:pStyle w:val="Heading3"/>
@@ -3122,82 +5136,153 @@
     </w:p>
     <w:p>
       <w:pPr>
+        <w:pStyle w:val="CaptionedFigure"/>
+      </w:pPr>
+      <w:r>
+        <w:drawing>
+          <wp:inline>
+            <wp:extent cx="5791200" cy="7155500"/>
+            <wp:effectExtent b="0" l="0" r="0" t="0"/>
+            <wp:docPr descr="Gambar 6.4 — Concepts &amp; Connections 6.1: Etsy’s Blue Ocean Strategy" title="" id="57" name="Picture"/>
+            <a:graphic>
+              <a:graphicData uri="http://schemas.openxmlformats.org/drawingml/2006/picture">
+                <pic:pic>
+                  <pic:nvPicPr>
+                    <pic:cNvPr descr="D:/DZAKI/S2/Sem.%201/Manajemen%20Strategik/Dev%20Assistant/temp/ch6_figures/cc_6_1_etsy.png" id="58" name="Picture"/>
+                    <pic:cNvPicPr>
+                      <a:picLocks noChangeArrowheads="1" noChangeAspect="1"/>
+                    </pic:cNvPicPr>
+                  </pic:nvPicPr>
+                  <pic:blipFill>
+                    <a:blip r:embed="rId56"/>
+                    <a:stretch>
+                      <a:fillRect/>
+                    </a:stretch>
+                  </pic:blipFill>
+                  <pic:spPr bwMode="auto">
+                    <a:xfrm>
+                      <a:off x="0" y="0"/>
+                      <a:ext cx="5791200" cy="7155500"/>
+                    </a:xfrm>
+                    <a:prstGeom prst="rect">
+                      <a:avLst/>
+                    </a:prstGeom>
+                    <a:noFill/>
+                    <a:ln w="9525">
+                      <a:noFill/>
+                      <a:headEnd/>
+                      <a:tailEnd/>
+                    </a:ln>
+                  </pic:spPr>
+                </pic:pic>
+              </a:graphicData>
+            </a:graphic>
+          </wp:inline>
+        </w:drawing>
+      </w:r>
+    </w:p>
+    <w:p>
+      <w:pPr>
+        <w:pStyle w:val="ImageCaption"/>
+      </w:pPr>
+      <w:r>
+        <w:rPr>
+          <w:i/>
+          <w:iCs/>
+        </w:rPr>
+        <w:t xml:space="preserve">Gambar 6.4 — Concepts &amp; Connections 6.1: Etsy’s Blue Ocean Strategy</w:t>
+      </w:r>
+    </w:p>
+    <w:p>
+      <w:pPr>
+        <w:pStyle w:val="BodyText"/>
+      </w:pPr>
+      <w:r>
+        <w:rPr>
+          <w:i/>
+          <w:iCs/>
+        </w:rPr>
+        <w:t xml:space="preserve">Sumber: Gamble, Thompson &amp; Peteraf (2021), Essentials of Strategic Management, Ch.6, p.114</w:t>
+      </w:r>
+    </w:p>
+    <w:p>
+      <w:pPr>
+        <w:pStyle w:val="BodyText"/>
+      </w:pPr>
+      <w:r>
+        <w:t xml:space="preserve">Kerangka operasional</w:t>
+      </w:r>
+      <w:r>
+        <w:t xml:space="preserve"> </w:t>
+      </w:r>
+      <w:r>
+        <w:rPr>
+          <w:i/>
+          <w:iCs/>
+        </w:rPr>
+        <w:t xml:space="preserve">Blue Ocean</w:t>
+      </w:r>
+      <w:r>
+        <w:t xml:space="preserve"> </w:t>
+      </w:r>
+      <w:r>
+        <w:t xml:space="preserve">adalah ERRC grid: empat pertanyaan tentang elemen yang dapat dieliminasi, dikurangi, ditingkatkan, dan diciptakan. Cirque du Soleil adalah contoh kanonik: mengeliminasi pertunjukan binatang (yang mahal dan kontroversial), mengurangi humor klasik sirkus (yang dianggap kurang sofistikasi), meningkatkan elemen artistik dan narasi, serta menciptakan pengalaman teatrikal yang sebelumnya tidak ada dalam kategori sirkus. Hasilnya adalah kategori baru — sirkus untuk audiens dewasa yang bersedia membayar harga premium — yang tidak bersaing dengan sirkus tradisional.</w:t>
+      </w:r>
+    </w:p>
+    <w:bookmarkEnd w:id="59"/>
+    <w:bookmarkStart w:id="60" w:name="kritik-apakah-blue-ocean-berkelanjutan"/>
+    <w:p>
+      <w:pPr>
+        <w:pStyle w:val="Heading3"/>
+      </w:pPr>
+      <w:r>
+        <w:t xml:space="preserve">Kritik: Apakah</w:t>
+      </w:r>
+      <w:r>
+        <w:t xml:space="preserve"> </w:t>
+      </w:r>
+      <w:r>
+        <w:rPr>
+          <w:i/>
+          <w:iCs/>
+        </w:rPr>
+        <w:t xml:space="preserve">Blue Ocean</w:t>
+      </w:r>
+      <w:r>
+        <w:t xml:space="preserve"> </w:t>
+      </w:r>
+      <w:r>
+        <w:t xml:space="preserve">Berkelanjutan?</w:t>
+      </w:r>
+    </w:p>
+    <w:p>
+      <w:pPr>
         <w:pStyle w:val="FirstParagraph"/>
       </w:pPr>
       <w:r>
-        <w:t xml:space="preserve">Kerangka operasional</w:t>
-      </w:r>
-      <w:r>
-        <w:t xml:space="preserve"> </w:t>
-      </w:r>
-      <w:r>
-        <w:rPr>
+        <w:rPr>
+          <w:b/>
+          <w:bCs/>
+        </w:rPr>
+        <w:t xml:space="preserve">Kritik substantif terhadap</w:t>
+      </w:r>
+      <w:r>
+        <w:rPr>
+          <w:b/>
+          <w:bCs/>
+        </w:rPr>
+        <w:t xml:space="preserve"> </w:t>
+      </w:r>
+      <w:r>
+        <w:rPr>
+          <w:b/>
+          <w:bCs/>
           <w:i/>
           <w:iCs/>
         </w:rPr>
         <w:t xml:space="preserve">Blue Ocean</w:t>
       </w:r>
       <w:r>
-        <w:t xml:space="preserve"> </w:t>
-      </w:r>
-      <w:r>
-        <w:t xml:space="preserve">adalah ERRC grid: empat pertanyaan tentang elemen yang dapat dieliminasi, dikurangi, ditingkatkan, dan diciptakan. Cirque du Soleil adalah contoh kanonik: mengeliminasi pertunjukan binatang (yang mahal dan kontroversial), mengurangi humor klasik sirkus (yang dianggap kurang sofistikasi), meningkatkan elemen artistik dan narasi, serta menciptakan pengalaman teatrikal yang sebelumnya tidak ada dalam kategori sirkus. Hasilnya adalah kategori baru — sirkus untuk audiens dewasa yang bersedia membayar harga premium — yang tidak bersaing dengan sirkus tradisional.</w:t>
-      </w:r>
-    </w:p>
-    <w:bookmarkEnd w:id="37"/>
-    <w:bookmarkStart w:id="38" w:name="kritik-apakah-blue-ocean-berkelanjutan"/>
-    <w:p>
-      <w:pPr>
-        <w:pStyle w:val="Heading3"/>
-      </w:pPr>
-      <w:r>
-        <w:t xml:space="preserve">Kritik: Apakah</w:t>
-      </w:r>
-      <w:r>
-        <w:t xml:space="preserve"> </w:t>
-      </w:r>
-      <w:r>
-        <w:rPr>
-          <w:i/>
-          <w:iCs/>
-        </w:rPr>
-        <w:t xml:space="preserve">Blue Ocean</w:t>
-      </w:r>
-      <w:r>
-        <w:t xml:space="preserve"> </w:t>
-      </w:r>
-      <w:r>
-        <w:t xml:space="preserve">Berkelanjutan?</w:t>
-      </w:r>
-    </w:p>
-    <w:p>
-      <w:pPr>
-        <w:pStyle w:val="FirstParagraph"/>
-      </w:pPr>
-      <w:r>
-        <w:rPr>
-          <w:b/>
-          <w:bCs/>
-        </w:rPr>
-        <w:t xml:space="preserve">Kritik substantif terhadap</w:t>
-      </w:r>
-      <w:r>
-        <w:rPr>
-          <w:b/>
-          <w:bCs/>
-        </w:rPr>
-        <w:t xml:space="preserve"> </w:t>
-      </w:r>
-      <w:r>
-        <w:rPr>
-          <w:b/>
-          <w:bCs/>
-          <w:i/>
-          <w:iCs/>
-        </w:rPr>
-        <w:t xml:space="preserve">Blue Ocean</w:t>
-      </w:r>
-      <w:r>
         <w:rPr>
           <w:b/>
           <w:bCs/>
@@ -3325,8 +5410,8 @@
         <w:t xml:space="preserve">di kategori yang baru?</w:t>
       </w:r>
     </w:p>
-    <w:bookmarkEnd w:id="38"/>
-    <w:bookmarkStart w:id="39" w:name="counter-counter-argument"/>
+    <w:bookmarkEnd w:id="60"/>
+    <w:bookmarkStart w:id="61" w:name="counter-counter-argument"/>
     <w:p>
       <w:pPr>
         <w:pStyle w:val="Heading3"/>
@@ -3600,9 +5685,9 @@
         </w:pict>
       </w:r>
     </w:p>
-    <w:bookmarkEnd w:id="39"/>
-    <w:bookmarkEnd w:id="40"/>
-    <w:bookmarkStart w:id="45" w:name="performance-measurement-sebagai-eksekusi"/>
+    <w:bookmarkEnd w:id="61"/>
+    <w:bookmarkEnd w:id="62"/>
+    <w:bookmarkStart w:id="67" w:name="performance-measurement-sebagai-eksekusi"/>
     <w:p>
       <w:pPr>
         <w:pStyle w:val="Heading2"/>
@@ -3627,7 +5712,7 @@
         <w:t xml:space="preserve">sebagai Eksekusi</w:t>
       </w:r>
     </w:p>
-    <w:bookmarkStart w:id="41" w:name="balanced-scorecard-empat-perspektif"/>
+    <w:bookmarkStart w:id="63" w:name="balanced-scorecard-empat-perspektif"/>
     <w:p>
       <w:pPr>
         <w:pStyle w:val="Heading3"/>
@@ -3771,8 +5856,8 @@
         <w:t xml:space="preserve">. BSC bukan dashboard pasif melainkan kerangka manajerial yang mengarahkan keputusan investasi dan alokasi sumber daya.</w:t>
       </w:r>
     </w:p>
-    <w:bookmarkEnd w:id="41"/>
-    <w:bookmarkStart w:id="42" w:name="strategy-maps-mengikat-kausalitas"/>
+    <w:bookmarkEnd w:id="63"/>
+    <w:bookmarkStart w:id="64" w:name="strategy-maps-mengikat-kausalitas"/>
     <w:p>
       <w:pPr>
         <w:pStyle w:val="Heading3"/>
@@ -3880,8 +5965,8 @@
         <w:t xml:space="preserve">) dengan mengorbankan perspektif lain yang tidak terlihat.</w:t>
       </w:r>
     </w:p>
-    <w:bookmarkEnd w:id="42"/>
-    <w:bookmarkStart w:id="43" w:name="mengapa-strategic-moves-gagal-tanpa-pms"/>
+    <w:bookmarkEnd w:id="64"/>
+    <w:bookmarkStart w:id="65" w:name="mengapa-strategic-moves-gagal-tanpa-pms"/>
     <w:p>
       <w:pPr>
         <w:pStyle w:val="Heading3"/>
@@ -4069,8 +6154,8 @@
         <w:t xml:space="preserve">ini, manajer mengandalkan intuisi yang mudah salah dan bias konfirmasi yang menyembunyikan masalah.</w:t>
       </w:r>
     </w:p>
-    <w:bookmarkEnd w:id="43"/>
-    <w:bookmarkStart w:id="44" w:name="jembatan-ke-teeratansirikool-et-al.-2013"/>
+    <w:bookmarkEnd w:id="65"/>
+    <w:bookmarkStart w:id="66" w:name="jembatan-ke-teeratansirikool-et-al.-2013"/>
     <w:p>
       <w:pPr>
         <w:pStyle w:val="Heading3"/>
@@ -4155,9 +6240,9 @@
         </w:pict>
       </w:r>
     </w:p>
-    <w:bookmarkEnd w:id="44"/>
-    <w:bookmarkEnd w:id="45"/>
-    <w:bookmarkStart w:id="50" w:name="Xc4c99381aa9f7af8e3a0197cfa6e80b5e39fea7"/>
+    <w:bookmarkEnd w:id="66"/>
+    <w:bookmarkEnd w:id="67"/>
+    <w:bookmarkStart w:id="72" w:name="Xc4c99381aa9f7af8e3a0197cfa6e80b5e39fea7"/>
     <w:p>
       <w:pPr>
         <w:pStyle w:val="Heading2"/>
@@ -4166,7 +6251,7 @@
         <w:t xml:space="preserve">8. Strategi Kompetitif dan Kinerja: Apa yang Kita Ketahui?</w:t>
       </w:r>
     </w:p>
-    <w:bookmarkStart w:id="46" w:name="konsensus-yang-kokoh"/>
+    <w:bookmarkStart w:id="68" w:name="konsensus-yang-kokoh"/>
     <w:p>
       <w:pPr>
         <w:pStyle w:val="Heading3"/>
@@ -4209,8 +6294,8 @@
         <w:t xml:space="preserve">yang diperingatkan Porter (1985) bukan sekadar kategorisasi teoretis melainkan kondisi yang secara empiris terdokumentasi merugikan kinerja. Ini adalah temuan yang stabil lintas industri, periode waktu, dan konteks geografis.</w:t>
       </w:r>
     </w:p>
-    <w:bookmarkEnd w:id="46"/>
-    <w:bookmarkStart w:id="47" w:name="debat-yang-belum-selesai"/>
+    <w:bookmarkEnd w:id="68"/>
+    <w:bookmarkStart w:id="69" w:name="debat-yang-belum-selesai"/>
     <w:p>
       <w:pPr>
         <w:pStyle w:val="Heading3"/>
@@ -4250,8 +6335,8 @@
         <w:t xml:space="preserve">. Apakah temuan ini berlaku untuk pasar berkembang lainnya, termasuk Indonesia, adalah pertanyaan terbuka.</w:t>
       </w:r>
     </w:p>
-    <w:bookmarkEnd w:id="47"/>
-    <w:bookmarkStart w:id="48" w:name="peran-moderating-variables"/>
+    <w:bookmarkEnd w:id="69"/>
+    <w:bookmarkStart w:id="70" w:name="peran-moderating-variables"/>
     <w:p>
       <w:pPr>
         <w:pStyle w:val="Heading3"/>
@@ -4348,8 +6433,8 @@
         <w:t xml:space="preserve">pada karakteristik perusahaan dan lingkungannya.</w:t>
       </w:r>
     </w:p>
-    <w:bookmarkEnd w:id="48"/>
-    <w:bookmarkStart w:id="49" w:name="jembatan-ke-onditi-2018"/>
+    <w:bookmarkEnd w:id="70"/>
+    <w:bookmarkStart w:id="71" w:name="jembatan-ke-onditi-2018"/>
     <w:p>
       <w:pPr>
         <w:pStyle w:val="Heading3"/>
@@ -4495,9 +6580,9 @@
         </w:pict>
       </w:r>
     </w:p>
-    <w:bookmarkEnd w:id="49"/>
-    <w:bookmarkEnd w:id="50"/>
-    <w:bookmarkStart w:id="54" w:name="kesimpulan"/>
+    <w:bookmarkEnd w:id="71"/>
+    <w:bookmarkEnd w:id="72"/>
+    <w:bookmarkStart w:id="76" w:name="kesimpulan"/>
     <w:p>
       <w:pPr>
         <w:pStyle w:val="Heading2"/>
@@ -4506,7 +6591,7 @@
         <w:t xml:space="preserve">9. Kesimpulan</w:t>
       </w:r>
     </w:p>
-    <w:bookmarkStart w:id="51" w:name="Xf281a55d3d05a31f5ed82bbac16178afe342c9e"/>
+    <w:bookmarkStart w:id="73" w:name="Xf281a55d3d05a31f5ed82bbac16178afe342c9e"/>
     <w:p>
       <w:pPr>
         <w:pStyle w:val="Heading3"/>
@@ -4568,8 +6653,8 @@
         <w:t xml:space="preserve">adalah keluarga keputusan yang harus ditinjau ulang secara periodik karena prasyarat yang membenarkan pilihan tertentu dapat berubah. Perusahaan yang berhenti pada perumusan strategi awal dan mengabaikan kalibrasi akan tergerus oleh pesaing yang lebih lincah, sementara perusahaan yang membangun infrastruktur PMS yang baik dapat mendeteksi perubahan kondisi lebih cepat dan mengkalibrasi gerakannya secara proaktif.</w:t>
       </w:r>
     </w:p>
-    <w:bookmarkEnd w:id="51"/>
-    <w:bookmarkStart w:id="52" w:name="integrasi-alur-analitik-pertemuan-46"/>
+    <w:bookmarkEnd w:id="73"/>
+    <w:bookmarkStart w:id="74" w:name="integrasi-alur-analitik-pertemuan-46"/>
     <w:p>
       <w:pPr>
         <w:pStyle w:val="Heading3"/>
@@ -4650,8 +6735,8 @@
         <w:t xml:space="preserve">eksekusi. Ketiganya tidak dapat dilepaskan: analisis sumber daya tanpa pilihan posisi adalah introspeksi yang tidak terhubung dengan pasar; pilihan posisi tanpa penguatan dan pengukuran adalah deklarasi yang tidak akan terealisasi.</w:t>
       </w:r>
     </w:p>
-    <w:bookmarkEnd w:id="52"/>
-    <w:bookmarkStart w:id="53" w:name="antisipasi-pertemuan-7"/>
+    <w:bookmarkEnd w:id="74"/>
+    <w:bookmarkStart w:id="75" w:name="antisipasi-pertemuan-7"/>
     <w:p>
       <w:pPr>
         <w:pStyle w:val="Heading3"/>
@@ -4760,9 +6845,500 @@
         <w:t xml:space="preserve">akan masuk ke dalam diskusi. Ini adalah perluasan logis dari yang dipelajari sejauh ini: setelah memahami bagaimana memenangkan posisi dalam satu industri, langkah berikutnya adalah memutuskan di industri mana saja perusahaan harus hadir dan bagaimana sinergi antarsegmen dapat dikelola. Astra International, GoTo, dan Salim Group adalah contoh konglomerat Indonesia yang menjawab pertanyaan korporat ini dengan jawaban yang berbeda; analisis komparatifnya akan membentuk inti pembahasan minggu depan.</w:t>
       </w:r>
     </w:p>
-    <w:bookmarkEnd w:id="53"/>
-    <w:bookmarkEnd w:id="54"/>
-    <w:bookmarkEnd w:id="55"/>
+    <w:p>
+      <w:r>
+        <w:pict>
+          <v:rect style="width:0;height:1.5pt" o:hralign="center" o:hrstd="t" o:hr="t"/>
+        </w:pict>
+      </w:r>
+    </w:p>
+    <w:bookmarkEnd w:id="75"/>
+    <w:bookmarkEnd w:id="76"/>
+    <w:bookmarkStart w:id="82" w:name="poin-poin-kunci-tpgs-ch.6"/>
+    <w:p>
+      <w:pPr>
+        <w:pStyle w:val="Heading2"/>
+      </w:pPr>
+      <w:r>
+        <w:t xml:space="preserve">10. Poin-Poin Kunci — TPGS Ch.6</w:t>
+      </w:r>
+    </w:p>
+    <w:p>
+      <w:pPr>
+        <w:pStyle w:val="FirstParagraph"/>
+      </w:pPr>
+      <w:r>
+        <w:rPr>
+          <w:i/>
+          <w:iCs/>
+        </w:rPr>
+        <w:t xml:space="preserve">Ringkasan resmi dari Gamble, Thompson &amp; Peteraf (2021), Essentials of Strategic Management, Ch.6</w:t>
+      </w:r>
+    </w:p>
+    <w:bookmarkStart w:id="77" w:name="lo6-1-strategi-ofensif-dan-defensif"/>
+    <w:p>
+      <w:pPr>
+        <w:pStyle w:val="Heading3"/>
+      </w:pPr>
+      <w:r>
+        <w:t xml:space="preserve">LO6-1 — Strategi Ofensif dan Defensif</w:t>
+      </w:r>
+    </w:p>
+    <w:p>
+      <w:pPr>
+        <w:pStyle w:val="Compact"/>
+        <w:numPr>
+          <w:ilvl w:val="0"/>
+          <w:numId w:val="1011"/>
+        </w:numPr>
+      </w:pPr>
+      <w:r>
+        <w:rPr>
+          <w:b/>
+          <w:bCs/>
+        </w:rPr>
+        <w:t xml:space="preserve">Serangan kompetitif</w:t>
+      </w:r>
+      <w:r>
+        <w:t xml:space="preserve"> </w:t>
+      </w:r>
+      <w:r>
+        <w:t xml:space="preserve">paling efektif menargetkan kelemahan pesaing, bukan kekuatan mereka</w:t>
+      </w:r>
+    </w:p>
+    <w:p>
+      <w:pPr>
+        <w:pStyle w:val="Compact"/>
+        <w:numPr>
+          <w:ilvl w:val="0"/>
+          <w:numId w:val="1011"/>
+        </w:numPr>
+      </w:pPr>
+      <w:r>
+        <w:t xml:space="preserve">Pilihan basis serangan: keunggulan biaya, segmen yang kurang terlayani, celah kualitas/fitur, inovasi, kesenjangan merek, atau celah distribusi</w:t>
+      </w:r>
+    </w:p>
+    <w:p>
+      <w:pPr>
+        <w:pStyle w:val="Compact"/>
+        <w:numPr>
+          <w:ilvl w:val="0"/>
+          <w:numId w:val="1011"/>
+        </w:numPr>
+      </w:pPr>
+      <w:r>
+        <w:rPr>
+          <w:b/>
+          <w:bCs/>
+        </w:rPr>
+        <w:t xml:space="preserve">Strategi defensif</w:t>
+      </w:r>
+      <w:r>
+        <w:t xml:space="preserve"> </w:t>
+      </w:r>
+      <w:r>
+        <w:t xml:space="preserve">bertujuan menurunkan risiko serangan, melemahkan dampaknya, atau mendorong penantang menyerang pesaing lain — bukan menghilangkan serangan sepenuhnya</w:t>
+      </w:r>
+    </w:p>
+    <w:p>
+      <w:pPr>
+        <w:pStyle w:val="Compact"/>
+        <w:numPr>
+          <w:ilvl w:val="0"/>
+          <w:numId w:val="1011"/>
+        </w:numPr>
+      </w:pPr>
+      <w:r>
+        <w:rPr>
+          <w:i/>
+          <w:iCs/>
+        </w:rPr>
+        <w:t xml:space="preserve">Signaling</w:t>
+      </w:r>
+      <w:r>
+        <w:t xml:space="preserve"> </w:t>
+      </w:r>
+      <w:r>
+        <w:t xml:space="preserve">yang kredibel dapat mencegah serangan sebelum dimulai</w:t>
+      </w:r>
+    </w:p>
+    <w:bookmarkEnd w:id="77"/>
+    <w:bookmarkStart w:id="78" w:name="lo6-2-timing-strategis"/>
+    <w:p>
+      <w:pPr>
+        <w:pStyle w:val="Heading3"/>
+      </w:pPr>
+      <w:r>
+        <w:t xml:space="preserve">LO6-2 — Timing Strategis</w:t>
+      </w:r>
+    </w:p>
+    <w:p>
+      <w:pPr>
+        <w:pStyle w:val="Compact"/>
+        <w:numPr>
+          <w:ilvl w:val="0"/>
+          <w:numId w:val="1012"/>
+        </w:numPr>
+      </w:pPr>
+      <w:r>
+        <w:t xml:space="preserve">Keunggulan</w:t>
+      </w:r>
+      <w:r>
+        <w:t xml:space="preserve"> </w:t>
+      </w:r>
+      <w:r>
+        <w:rPr>
+          <w:i/>
+          <w:iCs/>
+        </w:rPr>
+        <w:t xml:space="preserve">first-mover</w:t>
+      </w:r>
+      <w:r>
+        <w:t xml:space="preserve"> </w:t>
+      </w:r>
+      <w:r>
+        <w:t xml:space="preserve">paling kuat ketika: kurva belajar curam,</w:t>
+      </w:r>
+      <w:r>
+        <w:t xml:space="preserve"> </w:t>
+      </w:r>
+      <w:r>
+        <w:rPr>
+          <w:i/>
+          <w:iCs/>
+        </w:rPr>
+        <w:t xml:space="preserve">network effects</w:t>
+      </w:r>
+      <w:r>
+        <w:t xml:space="preserve"> </w:t>
+      </w:r>
+      <w:r>
+        <w:t xml:space="preserve">signifikan,</w:t>
+      </w:r>
+      <w:r>
+        <w:t xml:space="preserve"> </w:t>
+      </w:r>
+      <w:r>
+        <w:rPr>
+          <w:i/>
+          <w:iCs/>
+        </w:rPr>
+        <w:t xml:space="preserve">switching costs</w:t>
+      </w:r>
+      <w:r>
+        <w:t xml:space="preserve"> </w:t>
+      </w:r>
+      <w:r>
+        <w:t xml:space="preserve">tinggi, dan loyalitas merek terbentuk awal</w:t>
+      </w:r>
+    </w:p>
+    <w:p>
+      <w:pPr>
+        <w:pStyle w:val="Compact"/>
+        <w:numPr>
+          <w:ilvl w:val="0"/>
+          <w:numId w:val="1012"/>
+        </w:numPr>
+      </w:pPr>
+      <w:r>
+        <w:rPr>
+          <w:i/>
+          <w:iCs/>
+        </w:rPr>
+        <w:t xml:space="preserve">Late-mover</w:t>
+      </w:r>
+      <w:r>
+        <w:t xml:space="preserve"> </w:t>
+      </w:r>
+      <w:r>
+        <w:t xml:space="preserve">menguntungkan ketika: teknologi masih berevolusi, biaya perintisan tinggi, dan pasar belum matang</w:t>
+      </w:r>
+    </w:p>
+    <w:p>
+      <w:pPr>
+        <w:pStyle w:val="Compact"/>
+        <w:numPr>
+          <w:ilvl w:val="0"/>
+          <w:numId w:val="1012"/>
+        </w:numPr>
+      </w:pPr>
+      <w:r>
+        <w:t xml:space="preserve">Tidak ada jawaban universal — konteks industri dan sumber daya perusahaan menentukan pilihan optimal</w:t>
+      </w:r>
+    </w:p>
+    <w:bookmarkEnd w:id="78"/>
+    <w:bookmarkStart w:id="79" w:name="lo6-3-cakupan-operasi"/>
+    <w:p>
+      <w:pPr>
+        <w:pStyle w:val="Heading3"/>
+      </w:pPr>
+      <w:r>
+        <w:t xml:space="preserve">LO6-3 — Cakupan Operasi</w:t>
+      </w:r>
+    </w:p>
+    <w:p>
+      <w:pPr>
+        <w:pStyle w:val="Compact"/>
+        <w:numPr>
+          <w:ilvl w:val="0"/>
+          <w:numId w:val="1013"/>
+        </w:numPr>
+      </w:pPr>
+      <w:r>
+        <w:rPr>
+          <w:b/>
+          <w:bCs/>
+        </w:rPr>
+        <w:t xml:space="preserve">M&amp;A horizontal</w:t>
+      </w:r>
+      <w:r>
+        <w:t xml:space="preserve"> </w:t>
+      </w:r>
+      <w:r>
+        <w:t xml:space="preserve">memperkuat posisi pasar tetapi sering gagal karena estimasi sinergi berlebihan dan kesulitan integrasi budaya</w:t>
+      </w:r>
+    </w:p>
+    <w:p>
+      <w:pPr>
+        <w:pStyle w:val="Compact"/>
+        <w:numPr>
+          <w:ilvl w:val="0"/>
+          <w:numId w:val="1013"/>
+        </w:numPr>
+      </w:pPr>
+      <w:r>
+        <w:rPr>
+          <w:b/>
+          <w:bCs/>
+        </w:rPr>
+        <w:t xml:space="preserve">Integrasi vertikal</w:t>
+      </w:r>
+      <w:r>
+        <w:t xml:space="preserve"> </w:t>
+      </w:r>
+      <w:r>
+        <w:t xml:space="preserve">memberikan kendali rantai nilai tetapi meningkatkan risiko modal dan mengurangi fleksibilitas</w:t>
+      </w:r>
+    </w:p>
+    <w:p>
+      <w:pPr>
+        <w:pStyle w:val="Compact"/>
+        <w:numPr>
+          <w:ilvl w:val="0"/>
+          <w:numId w:val="1013"/>
+        </w:numPr>
+      </w:pPr>
+      <w:r>
+        <w:rPr>
+          <w:b/>
+          <w:bCs/>
+          <w:i/>
+          <w:iCs/>
+        </w:rPr>
+        <w:t xml:space="preserve">Outsourcing</w:t>
+      </w:r>
+      <w:r>
+        <w:t xml:space="preserve"> </w:t>
+      </w:r>
+      <w:r>
+        <w:t xml:space="preserve">meningkatkan fokus pada kompetensi inti tetapi mengandung risiko</w:t>
+      </w:r>
+      <w:r>
+        <w:t xml:space="preserve"> </w:t>
+      </w:r>
+      <w:r>
+        <w:rPr>
+          <w:i/>
+          <w:iCs/>
+        </w:rPr>
+        <w:t xml:space="preserve">hollowing out</w:t>
+      </w:r>
+      <w:r>
+        <w:t xml:space="preserve"> </w:t>
+      </w:r>
+      <w:r>
+        <w:t xml:space="preserve">kapabilitas esensial</w:t>
+      </w:r>
+    </w:p>
+    <w:p>
+      <w:pPr>
+        <w:pStyle w:val="Compact"/>
+        <w:numPr>
+          <w:ilvl w:val="0"/>
+          <w:numId w:val="1013"/>
+        </w:numPr>
+      </w:pPr>
+      <w:r>
+        <w:rPr>
+          <w:b/>
+          <w:bCs/>
+        </w:rPr>
+        <w:t xml:space="preserve">Aliansi dan JV</w:t>
+      </w:r>
+      <w:r>
+        <w:t xml:space="preserve"> </w:t>
+      </w:r>
+      <w:r>
+        <w:t xml:space="preserve">cocok untuk akses cepat ke teknologi atau pasar baru — tetapi tidak boleh menggantikan pembangunan kapabilitas internal</w:t>
+      </w:r>
+    </w:p>
+    <w:bookmarkEnd w:id="79"/>
+    <w:bookmarkStart w:id="80" w:name="lo6-4-aliansi-dan-kemitraan"/>
+    <w:p>
+      <w:pPr>
+        <w:pStyle w:val="Heading3"/>
+      </w:pPr>
+      <w:r>
+        <w:t xml:space="preserve">LO6-4 — Aliansi dan Kemitraan</w:t>
+      </w:r>
+    </w:p>
+    <w:p>
+      <w:pPr>
+        <w:pStyle w:val="Compact"/>
+        <w:numPr>
+          <w:ilvl w:val="0"/>
+          <w:numId w:val="1014"/>
+        </w:numPr>
+      </w:pPr>
+      <w:r>
+        <w:t xml:space="preserve">Aliansi paling efektif untuk akses cepat ke teknologi, pasar, atau kapabilitas yang akan mahal dan lama jika dibangun sendiri</w:t>
+      </w:r>
+    </w:p>
+    <w:p>
+      <w:pPr>
+        <w:pStyle w:val="Compact"/>
+        <w:numPr>
+          <w:ilvl w:val="0"/>
+          <w:numId w:val="1014"/>
+        </w:numPr>
+      </w:pPr>
+      <w:r>
+        <w:t xml:space="preserve">Aliansi gagal karena tujuan yang berubah, ketidakpercayaan,</w:t>
+      </w:r>
+      <w:r>
+        <w:t xml:space="preserve"> </w:t>
+      </w:r>
+      <w:r>
+        <w:rPr>
+          <w:i/>
+          <w:iCs/>
+        </w:rPr>
+        <w:t xml:space="preserve">free-riding</w:t>
+      </w:r>
+      <w:r>
+        <w:t xml:space="preserve">, dan kesulitan koordinasi lintas budaya</w:t>
+      </w:r>
+    </w:p>
+    <w:p>
+      <w:pPr>
+        <w:pStyle w:val="Compact"/>
+        <w:numPr>
+          <w:ilvl w:val="0"/>
+          <w:numId w:val="1014"/>
+        </w:numPr>
+      </w:pPr>
+      <w:r>
+        <w:t xml:space="preserve">Bahaya terbesar: bergantung pada aliansi untuk kapabilitas yang seharusnya dibangun secara internal (</w:t>
+      </w:r>
+      <w:r>
+        <w:rPr>
+          <w:i/>
+          <w:iCs/>
+        </w:rPr>
+        <w:t xml:space="preserve">hollowing out</w:t>
+      </w:r>
+      <w:r>
+        <w:t xml:space="preserve">)</w:t>
+      </w:r>
+    </w:p>
+    <w:bookmarkEnd w:id="80"/>
+    <w:bookmarkStart w:id="81" w:name="lo6-5-sintesis-manajerial"/>
+    <w:p>
+      <w:pPr>
+        <w:pStyle w:val="Heading3"/>
+      </w:pPr>
+      <w:r>
+        <w:t xml:space="preserve">LO6-5 — Sintesis Manajerial</w:t>
+      </w:r>
+    </w:p>
+    <w:p>
+      <w:pPr>
+        <w:pStyle w:val="Compact"/>
+        <w:numPr>
+          <w:ilvl w:val="0"/>
+          <w:numId w:val="1015"/>
+        </w:numPr>
+      </w:pPr>
+      <w:r>
+        <w:t xml:space="preserve">Tidak ada formula tunggal untuk memperkuat posisi kompetitif — pilihan ofensif/defensif/timing/</w:t>
+      </w:r>
+      <w:r>
+        <w:rPr>
+          <w:i/>
+          <w:iCs/>
+        </w:rPr>
+        <w:t xml:space="preserve">scope</w:t>
+      </w:r>
+      <w:r>
+        <w:t xml:space="preserve"> </w:t>
+      </w:r>
+      <w:r>
+        <w:t xml:space="preserve">harus disesuaikan dengan situasi industri, posisi relatif, dan sumber daya perusahaan</w:t>
+      </w:r>
+    </w:p>
+    <w:p>
+      <w:pPr>
+        <w:pStyle w:val="Compact"/>
+        <w:numPr>
+          <w:ilvl w:val="0"/>
+          <w:numId w:val="1015"/>
+        </w:numPr>
+      </w:pPr>
+      <w:r>
+        <w:t xml:space="preserve">Pilihan</w:t>
+      </w:r>
+      <w:r>
+        <w:t xml:space="preserve"> </w:t>
+      </w:r>
+      <w:r>
+        <w:rPr>
+          <w:i/>
+          <w:iCs/>
+        </w:rPr>
+        <w:t xml:space="preserve">strategic moves</w:t>
+      </w:r>
+      <w:r>
+        <w:t xml:space="preserve"> </w:t>
+      </w:r>
+      <w:r>
+        <w:t xml:space="preserve">yang tepat masih gagal tanpa sistem pengukuran kinerja yang selaras</w:t>
+      </w:r>
+    </w:p>
+    <w:p>
+      <w:pPr>
+        <w:pStyle w:val="Compact"/>
+        <w:numPr>
+          <w:ilvl w:val="0"/>
+          <w:numId w:val="1015"/>
+        </w:numPr>
+      </w:pPr>
+      <w:r>
+        <w:rPr>
+          <w:b/>
+          <w:bCs/>
+        </w:rPr>
+        <w:t xml:space="preserve">Strategi bukan pilihan statis</w:t>
+      </w:r>
+      <w:r>
+        <w:t xml:space="preserve"> </w:t>
+      </w:r>
+      <w:r>
+        <w:t xml:space="preserve">— harus dikalibrasi terus seiring perubahan lingkungan kompetitif</w:t>
+      </w:r>
+    </w:p>
+    <w:bookmarkEnd w:id="81"/>
+    <w:bookmarkEnd w:id="82"/>
+    <w:bookmarkEnd w:id="83"/>
     <w:sectPr>
       <w:pgSz w:h="15840" w:w="12240"/>
       <w:pgMar w:bottom="1417" w:footer="720" w:gutter="0" w:header="720" w:left="1701" w:right="1417" w:top="1701"/>
@@ -5043,6 +7619,194 @@
       <w:pPr>
         <w:ind w:left="6480" w:hanging="360"/>
       </w:pPr>
+    </w:lvl>
+  </w:abstractNum>
+  <w:abstractNum w:abstractNumId="99411">
+    <w:nsid w:val="00A99411"/>
+    <w:multiLevelType w:val="multilevel"/>
+    <w:lvl w:ilvl="0">
+      <w:start w:val="1"/>
+      <w:numFmt w:val="decimal"/>
+      <w:lvlText w:val="%1."/>
+      <w:lvlJc w:val="left"/>
+      <w:pPr>
+        <w:ind w:left="720" w:hanging="360"/>
+      </w:pPr>
+    </w:lvl>
+    <w:lvl w:ilvl="1">
+      <w:start w:val="1"/>
+      <w:numFmt w:val="decimal"/>
+      <w:lvlText w:val="%2."/>
+      <w:lvlJc w:val="left"/>
+      <w:pPr>
+        <w:ind w:left="1440" w:hanging="360"/>
+      </w:pPr>
+    </w:lvl>
+    <w:lvl w:ilvl="2">
+      <w:start w:val="1"/>
+      <w:numFmt w:val="decimal"/>
+      <w:lvlText w:val="%3."/>
+      <w:lvlJc w:val="left"/>
+      <w:pPr>
+        <w:ind w:left="2160" w:hanging="360"/>
+      </w:pPr>
+    </w:lvl>
+    <w:lvl w:ilvl="3">
+      <w:start w:val="1"/>
+      <w:numFmt w:val="decimal"/>
+      <w:lvlText w:val="%4."/>
+      <w:lvlJc w:val="left"/>
+      <w:pPr>
+        <w:ind w:left="2880" w:hanging="360"/>
+      </w:pPr>
+    </w:lvl>
+    <w:lvl w:ilvl="4">
+      <w:start w:val="1"/>
+      <w:numFmt w:val="decimal"/>
+      <w:lvlText w:val="%5."/>
+      <w:lvlJc w:val="left"/>
+      <w:pPr>
+        <w:ind w:left="3600" w:hanging="360"/>
+      </w:pPr>
+    </w:lvl>
+    <w:lvl w:ilvl="5">
+      <w:start w:val="1"/>
+      <w:numFmt w:val="decimal"/>
+      <w:lvlText w:val="%6."/>
+      <w:lvlJc w:val="left"/>
+      <w:pPr>
+        <w:ind w:left="4320" w:hanging="360"/>
+      </w:pPr>
+    </w:lvl>
+    <w:lvl w:ilvl="6">
+      <w:start w:val="1"/>
+      <w:numFmt w:val="decimal"/>
+      <w:lvlText w:val="%7."/>
+      <w:lvlJc w:val="left"/>
+      <w:pPr>
+        <w:ind w:left="5040" w:hanging="360"/>
+      </w:pPr>
+    </w:lvl>
+    <w:lvl w:ilvl="7">
+      <w:start w:val="1"/>
+      <w:numFmt w:val="decimal"/>
+      <w:lvlText w:val="%8."/>
+      <w:lvlJc w:val="left"/>
+      <w:pPr>
+        <w:ind w:left="5760" w:hanging="360"/>
+      </w:pPr>
+    </w:lvl>
+    <w:lvl w:ilvl="8">
+      <w:start w:val="1"/>
+      <w:numFmt w:val="decimal"/>
+      <w:lvlText w:val="%9."/>
+      <w:lvlJc w:val="left"/>
+      <w:pPr>
+        <w:ind w:left="6480" w:hanging="360"/>
+      </w:pPr>
+    </w:lvl>
+  </w:abstractNum>
+  <w:abstractNum w:abstractNumId="991">
+    <w:nsid w:val="0000A991"/>
+    <w:multiLevelType w:val="multilevel"/>
+    <w:lvl w:ilvl="0">
+      <w:numFmt w:val="bullet"/>
+      <w:lvlText w:val=""/>
+      <w:lvlJc w:val="left"/>
+      <w:pPr>
+        <w:ind w:left="720" w:hanging="360"/>
+      </w:pPr>
+      <w:rPr>
+        <w:rFonts w:ascii="Symbol" w:hAnsi="Symbol" w:cs="Symbol" w:hint="default"/>
+      </w:rPr>
+    </w:lvl>
+    <w:lvl w:ilvl="1">
+      <w:numFmt w:val="bullet"/>
+      <w:lvlText w:val="o"/>
+      <w:lvlJc w:val="left"/>
+      <w:pPr>
+        <w:ind w:left="1440" w:hanging="360"/>
+      </w:pPr>
+      <w:rPr>
+        <w:rFonts w:ascii="Courier New" w:hAnsi="Courier New" w:cs="Courier New" w:hint="default"/>
+      </w:rPr>
+    </w:lvl>
+    <w:lvl w:ilvl="2">
+      <w:numFmt w:val="bullet"/>
+      <w:lvlText w:val=""/>
+      <w:lvlJc w:val="left"/>
+      <w:pPr>
+        <w:ind w:left="2160" w:hanging="360"/>
+      </w:pPr>
+      <w:rPr>
+        <w:rFonts w:ascii="Wingdings" w:hAnsi="Wingdings" w:cs="Wingdings" w:hint="default"/>
+      </w:rPr>
+    </w:lvl>
+    <w:lvl w:ilvl="3">
+      <w:numFmt w:val="bullet"/>
+      <w:lvlText w:val=""/>
+      <w:lvlJc w:val="left"/>
+      <w:pPr>
+        <w:ind w:left="2880" w:hanging="360"/>
+      </w:pPr>
+      <w:rPr>
+        <w:rFonts w:ascii="Symbol" w:hAnsi="Symbol" w:cs="Symbol" w:hint="default"/>
+      </w:rPr>
+    </w:lvl>
+    <w:lvl w:ilvl="4">
+      <w:numFmt w:val="bullet"/>
+      <w:lvlText w:val="o"/>
+      <w:lvlJc w:val="left"/>
+      <w:pPr>
+        <w:ind w:left="3600" w:hanging="360"/>
+      </w:pPr>
+      <w:rPr>
+        <w:rFonts w:ascii="Courier New" w:hAnsi="Courier New" w:cs="Courier New" w:hint="default"/>
+      </w:rPr>
+    </w:lvl>
+    <w:lvl w:ilvl="5">
+      <w:numFmt w:val="bullet"/>
+      <w:lvlText w:val=""/>
+      <w:lvlJc w:val="left"/>
+      <w:pPr>
+        <w:ind w:left="4320" w:hanging="360"/>
+      </w:pPr>
+      <w:rPr>
+        <w:rFonts w:ascii="Wingdings" w:hAnsi="Wingdings" w:cs="Wingdings" w:hint="default"/>
+      </w:rPr>
+    </w:lvl>
+    <w:lvl w:ilvl="6">
+      <w:numFmt w:val="bullet"/>
+      <w:lvlText w:val=""/>
+      <w:lvlJc w:val="left"/>
+      <w:pPr>
+        <w:ind w:left="5040" w:hanging="360"/>
+      </w:pPr>
+      <w:rPr>
+        <w:rFonts w:ascii="Symbol" w:hAnsi="Symbol" w:cs="Symbol" w:hint="default"/>
+      </w:rPr>
+    </w:lvl>
+    <w:lvl w:ilvl="7">
+      <w:numFmt w:val="bullet"/>
+      <w:lvlText w:val="o"/>
+      <w:lvlJc w:val="left"/>
+      <w:pPr>
+        <w:ind w:left="5760" w:hanging="360"/>
+      </w:pPr>
+      <w:rPr>
+        <w:rFonts w:ascii="Courier New" w:hAnsi="Courier New" w:cs="Courier New" w:hint="default"/>
+      </w:rPr>
+    </w:lvl>
+    <w:lvl w:ilvl="8">
+      <w:numFmt w:val="bullet"/>
+      <w:lvlText w:val=""/>
+      <w:lvlJc w:val="left"/>
+      <w:pPr>
+        <w:ind w:left="6480" w:hanging="360"/>
+      </w:pPr>
+      <w:rPr>
+        <w:rFonts w:ascii="Wingdings" w:hAnsi="Wingdings" w:cs="Wingdings" w:hint="default"/>
+      </w:rPr>
     </w:lvl>
   </w:abstractNum>
   <w:num w:numId="1">
@@ -5074,6 +7838,186 @@
   </w:num>
   <w:num w:numId="1000">
     <w:abstractNumId w:val="990"/>
+  </w:num>
+  <w:num w:numId="1001">
+    <w:abstractNumId w:val="99411"/>
+    <w:lvlOverride w:ilvl="0">
+      <w:startOverride w:val="1"/>
+    </w:lvlOverride>
+    <w:lvlOverride w:ilvl="1">
+      <w:startOverride w:val="1"/>
+    </w:lvlOverride>
+    <w:lvlOverride w:ilvl="2">
+      <w:startOverride w:val="1"/>
+    </w:lvlOverride>
+    <w:lvlOverride w:ilvl="3">
+      <w:startOverride w:val="1"/>
+    </w:lvlOverride>
+    <w:lvlOverride w:ilvl="4">
+      <w:startOverride w:val="1"/>
+    </w:lvlOverride>
+    <w:lvlOverride w:ilvl="5">
+      <w:startOverride w:val="1"/>
+    </w:lvlOverride>
+    <w:lvlOverride w:ilvl="6">
+      <w:startOverride w:val="1"/>
+    </w:lvlOverride>
+    <w:lvlOverride w:ilvl="7">
+      <w:startOverride w:val="1"/>
+    </w:lvlOverride>
+    <w:lvlOverride w:ilvl="8">
+      <w:startOverride w:val="1"/>
+    </w:lvlOverride>
+  </w:num>
+  <w:num w:numId="1002">
+    <w:abstractNumId w:val="991"/>
+  </w:num>
+  <w:num w:numId="1003">
+    <w:abstractNumId w:val="991"/>
+  </w:num>
+  <w:num w:numId="1004">
+    <w:abstractNumId w:val="991"/>
+  </w:num>
+  <w:num w:numId="1005">
+    <w:abstractNumId w:val="991"/>
+  </w:num>
+  <w:num w:numId="1006">
+    <w:abstractNumId w:val="991"/>
+  </w:num>
+  <w:num w:numId="1007">
+    <w:abstractNumId w:val="99411"/>
+    <w:lvlOverride w:ilvl="0">
+      <w:startOverride w:val="1"/>
+    </w:lvlOverride>
+    <w:lvlOverride w:ilvl="1">
+      <w:startOverride w:val="1"/>
+    </w:lvlOverride>
+    <w:lvlOverride w:ilvl="2">
+      <w:startOverride w:val="1"/>
+    </w:lvlOverride>
+    <w:lvlOverride w:ilvl="3">
+      <w:startOverride w:val="1"/>
+    </w:lvlOverride>
+    <w:lvlOverride w:ilvl="4">
+      <w:startOverride w:val="1"/>
+    </w:lvlOverride>
+    <w:lvlOverride w:ilvl="5">
+      <w:startOverride w:val="1"/>
+    </w:lvlOverride>
+    <w:lvlOverride w:ilvl="6">
+      <w:startOverride w:val="1"/>
+    </w:lvlOverride>
+    <w:lvlOverride w:ilvl="7">
+      <w:startOverride w:val="1"/>
+    </w:lvlOverride>
+    <w:lvlOverride w:ilvl="8">
+      <w:startOverride w:val="1"/>
+    </w:lvlOverride>
+  </w:num>
+  <w:num w:numId="1008">
+    <w:abstractNumId w:val="99411"/>
+    <w:lvlOverride w:ilvl="0">
+      <w:startOverride w:val="1"/>
+    </w:lvlOverride>
+    <w:lvlOverride w:ilvl="1">
+      <w:startOverride w:val="1"/>
+    </w:lvlOverride>
+    <w:lvlOverride w:ilvl="2">
+      <w:startOverride w:val="1"/>
+    </w:lvlOverride>
+    <w:lvlOverride w:ilvl="3">
+      <w:startOverride w:val="1"/>
+    </w:lvlOverride>
+    <w:lvlOverride w:ilvl="4">
+      <w:startOverride w:val="1"/>
+    </w:lvlOverride>
+    <w:lvlOverride w:ilvl="5">
+      <w:startOverride w:val="1"/>
+    </w:lvlOverride>
+    <w:lvlOverride w:ilvl="6">
+      <w:startOverride w:val="1"/>
+    </w:lvlOverride>
+    <w:lvlOverride w:ilvl="7">
+      <w:startOverride w:val="1"/>
+    </w:lvlOverride>
+    <w:lvlOverride w:ilvl="8">
+      <w:startOverride w:val="1"/>
+    </w:lvlOverride>
+  </w:num>
+  <w:num w:numId="1009">
+    <w:abstractNumId w:val="99411"/>
+    <w:lvlOverride w:ilvl="0">
+      <w:startOverride w:val="1"/>
+    </w:lvlOverride>
+    <w:lvlOverride w:ilvl="1">
+      <w:startOverride w:val="1"/>
+    </w:lvlOverride>
+    <w:lvlOverride w:ilvl="2">
+      <w:startOverride w:val="1"/>
+    </w:lvlOverride>
+    <w:lvlOverride w:ilvl="3">
+      <w:startOverride w:val="1"/>
+    </w:lvlOverride>
+    <w:lvlOverride w:ilvl="4">
+      <w:startOverride w:val="1"/>
+    </w:lvlOverride>
+    <w:lvlOverride w:ilvl="5">
+      <w:startOverride w:val="1"/>
+    </w:lvlOverride>
+    <w:lvlOverride w:ilvl="6">
+      <w:startOverride w:val="1"/>
+    </w:lvlOverride>
+    <w:lvlOverride w:ilvl="7">
+      <w:startOverride w:val="1"/>
+    </w:lvlOverride>
+    <w:lvlOverride w:ilvl="8">
+      <w:startOverride w:val="1"/>
+    </w:lvlOverride>
+  </w:num>
+  <w:num w:numId="1010">
+    <w:abstractNumId w:val="99411"/>
+    <w:lvlOverride w:ilvl="0">
+      <w:startOverride w:val="1"/>
+    </w:lvlOverride>
+    <w:lvlOverride w:ilvl="1">
+      <w:startOverride w:val="1"/>
+    </w:lvlOverride>
+    <w:lvlOverride w:ilvl="2">
+      <w:startOverride w:val="1"/>
+    </w:lvlOverride>
+    <w:lvlOverride w:ilvl="3">
+      <w:startOverride w:val="1"/>
+    </w:lvlOverride>
+    <w:lvlOverride w:ilvl="4">
+      <w:startOverride w:val="1"/>
+    </w:lvlOverride>
+    <w:lvlOverride w:ilvl="5">
+      <w:startOverride w:val="1"/>
+    </w:lvlOverride>
+    <w:lvlOverride w:ilvl="6">
+      <w:startOverride w:val="1"/>
+    </w:lvlOverride>
+    <w:lvlOverride w:ilvl="7">
+      <w:startOverride w:val="1"/>
+    </w:lvlOverride>
+    <w:lvlOverride w:ilvl="8">
+      <w:startOverride w:val="1"/>
+    </w:lvlOverride>
+  </w:num>
+  <w:num w:numId="1011">
+    <w:abstractNumId w:val="991"/>
+  </w:num>
+  <w:num w:numId="1012">
+    <w:abstractNumId w:val="991"/>
+  </w:num>
+  <w:num w:numId="1013">
+    <w:abstractNumId w:val="991"/>
+  </w:num>
+  <w:num w:numId="1014">
+    <w:abstractNumId w:val="991"/>
+  </w:num>
+  <w:num w:numId="1015">
+    <w:abstractNumId w:val="991"/>
   </w:num>
 </w:numbering>
 </file>

</xml_diff>